<commit_message>
update readme & document
</commit_message>
<xml_diff>
--- a/docs/uts/Perencanaan Game.docx
+++ b/docs/uts/Perencanaan Game.docx
@@ -8,57 +8,52 @@
         <w:jc w:val="center"/>
       </w:pPr>
       <w:r>
-        <w:t xml:space="preserve">Template Perencanaan Proyek Game &amp; Rubrik </w:t>
-      </w:r>
-      <w:proofErr w:type="spellStart"/>
-      <w:r>
-        <w:t>Penilaian</w:t>
-      </w:r>
-      <w:proofErr w:type="spellEnd"/>
-      <w:r>
-        <w:t xml:space="preserve"> {Ganti </w:t>
-      </w:r>
-      <w:proofErr w:type="spellStart"/>
-      <w:r>
-        <w:t>dengan</w:t>
-      </w:r>
-      <w:proofErr w:type="spellEnd"/>
-      <w:r>
-        <w:t xml:space="preserve"> format GENRE GAME : JUDUL GAME}</w:t>
+        <w:rPr>
+          <w:rFonts w:cs="Calibri"/>
+        </w:rPr>
+        <w:t>PAPER WARFIRE:  PERMAINAN PERANG 2D DENGAN MEKANIK COMMAND PLANNING DAN FOG OF WAR</w:t>
       </w:r>
     </w:p>
     <w:p>
       <w:r>
-        <w:t xml:space="preserve">Dokumen ini berisi cetak biru perencanaan game beserta rubrik penilaian teknis dan User Experience (UX) yang bersifat universal </w:t>
-      </w:r>
-      <w:proofErr w:type="spellStart"/>
-      <w:r>
-        <w:t>untuk</w:t>
-      </w:r>
-      <w:proofErr w:type="spellEnd"/>
-      <w:r>
-        <w:t xml:space="preserve"> </w:t>
-      </w:r>
-      <w:proofErr w:type="spellStart"/>
-      <w:r>
-        <w:t>berbagai</w:t>
-      </w:r>
-      <w:proofErr w:type="spellEnd"/>
-      <w:r>
-        <w:t xml:space="preserve"> genre game.</w:t>
+        <w:rPr>
+          <w:rFonts w:cs="Cambria"/>
+        </w:rPr>
+        <w:t>Dokumen ini berisi cetak biru perencanaan game strategi berbasis grid 2D 'Paper Warfire' yang mengimplementasikan sistem perencanaan giliran simultan (WEGO), kabut perang (Fog of War), dan penargetan serangan koordinat manual, dilengkapi dengan rubrik penilaian teknis dan User Experience (UX).</w:t>
       </w:r>
     </w:p>
     <w:p>
       <w:r>
+        <w:rPr>
+          <w:rFonts w:cs="Cambria"/>
+        </w:rPr>
         <w:t xml:space="preserve">Nama </w:t>
       </w:r>
       <w:proofErr w:type="spellStart"/>
       <w:r>
+        <w:rPr>
+          <w:rFonts w:cs="Cambria"/>
+        </w:rPr>
         <w:t>Anggota</w:t>
       </w:r>
       <w:proofErr w:type="spellEnd"/>
       <w:r>
-        <w:t xml:space="preserve"> : </w:t>
+        <w:rPr>
+          <w:rFonts w:cs="Cambria"/>
+        </w:rPr>
+        <w:t xml:space="preserve"> Kelompo</w:t>
+      </w:r>
+      <w:r>
+        <w:rPr>
+          <w:rFonts w:cs="Cambria"/>
+        </w:rPr>
+        <w:t>k</w:t>
+      </w:r>
+      <w:r>
+        <w:rPr>
+          <w:rFonts w:cs="Cambria"/>
+        </w:rPr>
+        <w:t>:</w:t>
       </w:r>
     </w:p>
     <w:p>
@@ -69,13 +64,11 @@
           <w:numId w:val="11"/>
         </w:numPr>
       </w:pPr>
-      <w:proofErr w:type="spellStart"/>
       <w:r>
-        <w:t>si</w:t>
-      </w:r>
-      <w:proofErr w:type="spellEnd"/>
-      <w:r>
-        <w:t xml:space="preserve"> A (NIM)</w:t>
+        <w:rPr>
+          <w:rFonts w:cs="Cambria"/>
+        </w:rPr>
+        <w:t>FADLULLAH HASAN (F1D02310008)</w:t>
       </w:r>
     </w:p>
     <w:p>
@@ -86,13 +79,11 @@
           <w:numId w:val="11"/>
         </w:numPr>
       </w:pPr>
-      <w:proofErr w:type="spellStart"/>
       <w:r>
-        <w:t>si</w:t>
-      </w:r>
-      <w:proofErr w:type="spellEnd"/>
-      <w:r>
-        <w:t xml:space="preserve"> B (NIM)</w:t>
+        <w:rPr>
+          <w:rFonts w:cs="Cambria"/>
+        </w:rPr>
+        <w:t>DATU REKSA HAMZA PUTRA (F1D02310045)</w:t>
       </w:r>
     </w:p>
     <w:p>
@@ -103,19 +94,11 @@
           <w:numId w:val="11"/>
         </w:numPr>
       </w:pPr>
-      <w:proofErr w:type="spellStart"/>
       <w:r>
-        <w:t>si</w:t>
-      </w:r>
-      <w:proofErr w:type="spellEnd"/>
-      <w:r>
-        <w:t xml:space="preserve"> </w:t>
-      </w:r>
-      <w:r>
-        <w:t>C</w:t>
-      </w:r>
-      <w:r>
-        <w:t xml:space="preserve"> (NIM)</w:t>
+        <w:rPr>
+          <w:rFonts w:cs="Cambria"/>
+        </w:rPr>
+        <w:t>LALU MUHAMMAD RIZALDI KURNIAWAN (F1D02310120)</w:t>
       </w:r>
     </w:p>
     <w:p>
@@ -123,17 +106,90 @@
         <w:pStyle w:val="Heading1"/>
       </w:pPr>
       <w:r>
+        <w:rPr>
+          <w:rFonts w:cs="Calibri"/>
+        </w:rPr>
         <w:t>1. Arsitektur &amp; Alur Game (Loop &amp; State)</w:t>
       </w:r>
     </w:p>
     <w:p>
       <w:r>
-        <w:t>Main Game Loop: Alur logika dasar berjalan secara terus-menerus memantau input, memperbarui logika (update), dan menggambar ulang layar (render) hingga pemain keluar dari aplikasi.</w:t>
+        <w:rPr>
+          <w:rFonts w:cs="Cambria"/>
+        </w:rPr>
+        <w:t xml:space="preserve">Main Game Loop &amp; Time Management: Permainan berjalan pada target 60 FPS stabil menggunakan batasan </w:t>
+      </w:r>
+      <w:proofErr w:type="gramStart"/>
+      <w:r>
+        <w:rPr>
+          <w:rFonts w:cs="Cambria"/>
+        </w:rPr>
+        <w:t>pygame.time</w:t>
+      </w:r>
+      <w:proofErr w:type="gramEnd"/>
+      <w:r>
+        <w:rPr>
+          <w:rFonts w:cs="Cambria"/>
+        </w:rPr>
+        <w:t>.</w:t>
+      </w:r>
+      <w:proofErr w:type="gramStart"/>
+      <w:r>
+        <w:rPr>
+          <w:rFonts w:cs="Cambria"/>
+        </w:rPr>
+        <w:t>Clock(</w:t>
+      </w:r>
+      <w:proofErr w:type="gramEnd"/>
+      <w:r>
+        <w:rPr>
+          <w:rFonts w:cs="Cambria"/>
+        </w:rPr>
+        <w:t>). Setiap frame menghitung delta time (dt dalam detik) untuk menginterpolasi pergerakan unit pada War Phase, timer perencanaan, serta efek visual tanpa bergantung pada clock speed prosesor. Siklus loop terbagi menjadi tiga tahapan tegas:</w:t>
+      </w:r>
+      <w:r>
+        <w:br/>
+      </w:r>
+      <w:r>
+        <w:rPr>
+          <w:rFonts w:cs="Cambria"/>
+        </w:rPr>
+        <w:t>1. Input Processing: Mengumpulkan antrean event Pygame (klik mouse koordinat, pengetikan teks koordinat, tombol UI, dan shortcut).</w:t>
+      </w:r>
+      <w:r>
+        <w:br/>
+      </w:r>
+      <w:r>
+        <w:rPr>
+          <w:rFonts w:cs="Cambria"/>
+        </w:rPr>
+        <w:t>2. Logic Update: Memperbarui State Manager, memvalidasi aturan pergerakan grid, mengeksekusi antrean perintah simultan WEGO, menghitung damage AoE, memperbarui radius pandang kabut perang (Fog of War), dan mengevaluasi syarat kemenangan.</w:t>
+      </w:r>
+      <w:r>
+        <w:br/>
+      </w:r>
+      <w:r>
+        <w:rPr>
+          <w:rFonts w:cs="Cambria"/>
+        </w:rPr>
+        <w:t>3. Rendering: Membersihkan layar (fill background), menggambar layer terrain grid (24x16 tile), layer unit kawan dan lawan yang terlihat, layer kabut perang (Fog of War surface), layer indikator reticle penargetan, serta layer antarmuka HUD secara berlapis.</w:t>
       </w:r>
     </w:p>
     <w:p>
       <w:r>
-        <w:t>Contoh Alur Progresi: Main Menu -&gt; Play State (Gameplay) -&gt; Pause/Transition -&gt; End State (Menang/Kalah) -&gt; Kembali ke Main Menu.</w:t>
+        <w:rPr>
+          <w:rFonts w:cs="Cambria"/>
+        </w:rPr>
+        <w:t>Alur Progresi State &amp; Siklus WEGO:</w:t>
+      </w:r>
+      <w:r>
+        <w:br/>
+      </w:r>
+      <w:r>
+        <w:rPr>
+          <w:rFonts w:cs="Cambria"/>
+        </w:rPr>
+        <w:t>Main Menu -&gt; Playing State (Siklus Giliran WEGO: Planning Phase [Pemain &amp; AI menyusun perintah bersamaan] -&gt; War Phase [Resolusi eksekusi simultan: Gerak -&gt; Pengintaian -&gt; Tembakan Serentak -&gt; Eliminasi -&gt; Fog Update] -&gt; Turn Summary [Perolehan koin, upgrade unit, cek kondisi menang/kalah]) &lt;-&gt; Pause State -&gt; End State (Victory Screen / Defeat Screen) -&gt; Main Menu.</w:t>
       </w:r>
     </w:p>
     <w:p>
@@ -141,26 +197,47 @@
         <w:pStyle w:val="Heading2"/>
       </w:pPr>
       <w:r>
-        <w:t>Daftar State Game:</w:t>
+        <w:rPr>
+          <w:rFonts w:cs="Calibri"/>
+        </w:rPr>
+        <w:t>Daftar State Game &amp; Sub-State Mesin Tempur:</w:t>
       </w:r>
     </w:p>
     <w:tbl>
       <w:tblPr>
         <w:tblStyle w:val="TableGrid"/>
         <w:tblW w:w="0" w:type="auto"/>
-        <w:tblLook w:val="04A0" w:firstRow="1" w:lastRow="0" w:firstColumn="1" w:lastColumn="0" w:noHBand="0" w:noVBand="1"/>
+        <w:tblLook w:val="07E0" w:firstRow="1" w:lastRow="1" w:firstColumn="1" w:lastColumn="1" w:noHBand="1" w:noVBand="1"/>
       </w:tblPr>
       <w:tblGrid>
-        <w:gridCol w:w="4320"/>
-        <w:gridCol w:w="4320"/>
+        <w:gridCol w:w="4313"/>
+        <w:gridCol w:w="4317"/>
       </w:tblGrid>
       <w:tr>
         <w:tc>
           <w:tcPr>
             <w:tcW w:w="4320" w:type="dxa"/>
+            <w:tcBorders>
+              <w:top w:val="single" w:sz="4" w:space="0" w:color="auto"/>
+              <w:left w:val="single" w:sz="4" w:space="0" w:color="auto"/>
+              <w:bottom w:val="single" w:sz="4" w:space="0" w:color="auto"/>
+              <w:right w:val="single" w:sz="4" w:space="0" w:color="auto"/>
+            </w:tcBorders>
+            <w:tcMar>
+              <w:top w:w="0" w:type="dxa"/>
+              <w:left w:w="108" w:type="dxa"/>
+              <w:bottom w:w="0" w:type="dxa"/>
+              <w:right w:w="108" w:type="dxa"/>
+            </w:tcMar>
           </w:tcPr>
           <w:p>
+            <w:pPr>
+              <w:spacing w:after="200" w:line="276" w:lineRule="auto"/>
+            </w:pPr>
             <w:r>
+              <w:rPr>
+                <w:rFonts w:cs="Cambria"/>
+              </w:rPr>
               <w:t>State</w:t>
             </w:r>
           </w:p>
@@ -168,9 +245,27 @@
         <w:tc>
           <w:tcPr>
             <w:tcW w:w="4320" w:type="dxa"/>
+            <w:tcBorders>
+              <w:top w:val="single" w:sz="4" w:space="0" w:color="auto"/>
+              <w:left w:val="single" w:sz="4" w:space="0" w:color="auto"/>
+              <w:bottom w:val="single" w:sz="4" w:space="0" w:color="auto"/>
+              <w:right w:val="single" w:sz="4" w:space="0" w:color="auto"/>
+            </w:tcBorders>
+            <w:tcMar>
+              <w:top w:w="0" w:type="dxa"/>
+              <w:left w:w="108" w:type="dxa"/>
+              <w:bottom w:w="0" w:type="dxa"/>
+              <w:right w:w="108" w:type="dxa"/>
+            </w:tcMar>
           </w:tcPr>
           <w:p>
+            <w:pPr>
+              <w:spacing w:after="200" w:line="276" w:lineRule="auto"/>
+            </w:pPr>
             <w:r>
+              <w:rPr>
+                <w:rFonts w:cs="Cambria"/>
+              </w:rPr>
               <w:t>Deskripsi &amp; Fungsi Utama</w:t>
             </w:r>
           </w:p>
@@ -180,9 +275,28 @@
         <w:tc>
           <w:tcPr>
             <w:tcW w:w="4320" w:type="dxa"/>
+            <w:tcBorders>
+              <w:top w:val="single" w:sz="4" w:space="0" w:color="auto"/>
+              <w:left w:val="single" w:sz="4" w:space="0" w:color="auto"/>
+              <w:bottom w:val="single" w:sz="4" w:space="0" w:color="auto"/>
+              <w:right w:val="single" w:sz="4" w:space="0" w:color="auto"/>
+            </w:tcBorders>
+            <w:tcMar>
+              <w:top w:w="0" w:type="dxa"/>
+              <w:left w:w="108" w:type="dxa"/>
+              <w:bottom w:w="0" w:type="dxa"/>
+              <w:right w:w="108" w:type="dxa"/>
+            </w:tcMar>
           </w:tcPr>
           <w:p>
+            <w:pPr>
+              <w:spacing w:after="200" w:line="276" w:lineRule="auto"/>
+            </w:pPr>
             <w:r>
+              <w:rPr>
+                <w:rFonts w:cs="Cambria"/>
+              </w:rPr>
+              <w:lastRenderedPageBreak/>
               <w:t>MENU_STATE</w:t>
             </w:r>
           </w:p>
@@ -190,10 +304,112 @@
         <w:tc>
           <w:tcPr>
             <w:tcW w:w="4320" w:type="dxa"/>
+            <w:tcBorders>
+              <w:top w:val="single" w:sz="4" w:space="0" w:color="auto"/>
+              <w:left w:val="single" w:sz="4" w:space="0" w:color="auto"/>
+              <w:bottom w:val="single" w:sz="4" w:space="0" w:color="auto"/>
+              <w:right w:val="single" w:sz="4" w:space="0" w:color="auto"/>
+            </w:tcBorders>
+            <w:tcMar>
+              <w:top w:w="0" w:type="dxa"/>
+              <w:left w:w="108" w:type="dxa"/>
+              <w:bottom w:w="0" w:type="dxa"/>
+              <w:right w:w="108" w:type="dxa"/>
+            </w:tcMar>
           </w:tcPr>
           <w:p>
+            <w:pPr>
+              <w:spacing w:after="200" w:line="276" w:lineRule="auto"/>
+            </w:pPr>
             <w:r>
-              <w:t>Layar awal saat game dibuka. Fungsi: ShowMenu(), HandleMenuInput()</w:t>
+              <w:rPr>
+                <w:rFonts w:cs="Cambria"/>
+              </w:rPr>
+              <w:t xml:space="preserve">Layar awal aplikasi saat game dijalankan. Fungsi: </w:t>
+            </w:r>
+            <w:proofErr w:type="gramStart"/>
+            <w:r>
+              <w:rPr>
+                <w:rFonts w:cs="Cambria"/>
+              </w:rPr>
+              <w:t>ShowMainMenu(</w:t>
+            </w:r>
+            <w:proofErr w:type="gramEnd"/>
+            <w:r>
+              <w:rPr>
+                <w:rFonts w:cs="Cambria"/>
+              </w:rPr>
+              <w:t xml:space="preserve">), </w:t>
+            </w:r>
+            <w:proofErr w:type="gramStart"/>
+            <w:r>
+              <w:rPr>
+                <w:rFonts w:cs="Cambria"/>
+              </w:rPr>
+              <w:t>HandleMenuNavigation(</w:t>
+            </w:r>
+            <w:proofErr w:type="gramEnd"/>
+            <w:r>
+              <w:rPr>
+                <w:rFonts w:cs="Cambria"/>
+              </w:rPr>
+              <w:t xml:space="preserve">), </w:t>
+            </w:r>
+            <w:proofErr w:type="gramStart"/>
+            <w:r>
+              <w:rPr>
+                <w:rFonts w:cs="Cambria"/>
+              </w:rPr>
+              <w:t>StartBattle(</w:t>
+            </w:r>
+            <w:proofErr w:type="gramEnd"/>
+            <w:r>
+              <w:rPr>
+                <w:rFonts w:cs="Cambria"/>
+              </w:rPr>
+              <w:t xml:space="preserve">), </w:t>
+            </w:r>
+            <w:proofErr w:type="gramStart"/>
+            <w:r>
+              <w:rPr>
+                <w:rFonts w:cs="Cambria"/>
+              </w:rPr>
+              <w:t>ShowHowToPlay(</w:t>
+            </w:r>
+            <w:proofErr w:type="gramEnd"/>
+            <w:r>
+              <w:rPr>
+                <w:rFonts w:cs="Cambria"/>
+              </w:rPr>
+              <w:t xml:space="preserve">), </w:t>
+            </w:r>
+            <w:proofErr w:type="gramStart"/>
+            <w:r>
+              <w:rPr>
+                <w:rFonts w:cs="Cambria"/>
+              </w:rPr>
+              <w:t>OpenSettings(</w:t>
+            </w:r>
+            <w:proofErr w:type="gramEnd"/>
+            <w:r>
+              <w:rPr>
+                <w:rFonts w:cs="Cambria"/>
+              </w:rPr>
+              <w:t xml:space="preserve">), </w:t>
+            </w:r>
+            <w:proofErr w:type="gramStart"/>
+            <w:r>
+              <w:rPr>
+                <w:rFonts w:cs="Cambria"/>
+              </w:rPr>
+              <w:t>QuitGame(</w:t>
+            </w:r>
+            <w:proofErr w:type="gramEnd"/>
+            <w:r>
+              <w:rPr>
+                <w:rFonts w:cs="Cambria"/>
+              </w:rPr>
+              <w:t>).</w:t>
             </w:r>
           </w:p>
         </w:tc>
@@ -202,9 +418,27 @@
         <w:tc>
           <w:tcPr>
             <w:tcW w:w="4320" w:type="dxa"/>
+            <w:tcBorders>
+              <w:top w:val="single" w:sz="4" w:space="0" w:color="auto"/>
+              <w:left w:val="single" w:sz="4" w:space="0" w:color="auto"/>
+              <w:bottom w:val="single" w:sz="4" w:space="0" w:color="auto"/>
+              <w:right w:val="single" w:sz="4" w:space="0" w:color="auto"/>
+            </w:tcBorders>
+            <w:tcMar>
+              <w:top w:w="0" w:type="dxa"/>
+              <w:left w:w="108" w:type="dxa"/>
+              <w:bottom w:w="0" w:type="dxa"/>
+              <w:right w:w="108" w:type="dxa"/>
+            </w:tcMar>
           </w:tcPr>
           <w:p>
+            <w:pPr>
+              <w:spacing w:after="200" w:line="276" w:lineRule="auto"/>
+            </w:pPr>
             <w:r>
+              <w:rPr>
+                <w:rFonts w:cs="Cambria"/>
+              </w:rPr>
               <w:t>PLAY_STATE</w:t>
             </w:r>
           </w:p>
@@ -212,10 +446,265 @@
         <w:tc>
           <w:tcPr>
             <w:tcW w:w="4320" w:type="dxa"/>
+            <w:tcBorders>
+              <w:top w:val="single" w:sz="4" w:space="0" w:color="auto"/>
+              <w:left w:val="single" w:sz="4" w:space="0" w:color="auto"/>
+              <w:bottom w:val="single" w:sz="4" w:space="0" w:color="auto"/>
+              <w:right w:val="single" w:sz="4" w:space="0" w:color="auto"/>
+            </w:tcBorders>
+            <w:tcMar>
+              <w:top w:w="0" w:type="dxa"/>
+              <w:left w:w="108" w:type="dxa"/>
+              <w:bottom w:w="0" w:type="dxa"/>
+              <w:right w:w="108" w:type="dxa"/>
+            </w:tcMar>
           </w:tcPr>
           <w:p>
+            <w:pPr>
+              <w:spacing w:after="200" w:line="276" w:lineRule="auto"/>
+            </w:pPr>
             <w:r>
-              <w:t>Logika utama saat pemain di dalam level. Fungsi: UpdatePhysics(), CheckCollisions(), RenderGameplay()</w:t>
+              <w:rPr>
+                <w:rFonts w:cs="Cambria"/>
+              </w:rPr>
+              <w:t>Mesin tempur utama permainan yang mengontrol jalannya pertempuran. Mengelola 3 sub-state giliran WEGO:</w:t>
+            </w:r>
+            <w:r>
+              <w:br/>
+            </w:r>
+            <w:r>
+              <w:rPr>
+                <w:rFonts w:cs="Cambria"/>
+              </w:rPr>
+              <w:t xml:space="preserve">a. SUB_PLANNING: Pemain memilih unit dan menginput perintah; AI merencanakan aksi otonom secara rahasia. Fungsi: </w:t>
+            </w:r>
+            <w:proofErr w:type="gramStart"/>
+            <w:r>
+              <w:rPr>
+                <w:rFonts w:cs="Cambria"/>
+              </w:rPr>
+              <w:t>SelectUnit(</w:t>
+            </w:r>
+            <w:proofErr w:type="gramEnd"/>
+            <w:r>
+              <w:rPr>
+                <w:rFonts w:cs="Cambria"/>
+              </w:rPr>
+              <w:t xml:space="preserve">), </w:t>
+            </w:r>
+            <w:proofErr w:type="gramStart"/>
+            <w:r>
+              <w:rPr>
+                <w:rFonts w:cs="Cambria"/>
+              </w:rPr>
+              <w:t>InputTargetCoordinate(</w:t>
+            </w:r>
+            <w:proofErr w:type="gramEnd"/>
+            <w:r>
+              <w:rPr>
+                <w:rFonts w:cs="Cambria"/>
+              </w:rPr>
+              <w:t xml:space="preserve">), </w:t>
+            </w:r>
+            <w:proofErr w:type="gramStart"/>
+            <w:r>
+              <w:rPr>
+                <w:rFonts w:cs="Cambria"/>
+              </w:rPr>
+              <w:t>ValidateCommand(</w:t>
+            </w:r>
+            <w:proofErr w:type="gramEnd"/>
+            <w:r>
+              <w:rPr>
+                <w:rFonts w:cs="Cambria"/>
+              </w:rPr>
+              <w:t xml:space="preserve">), </w:t>
+            </w:r>
+            <w:proofErr w:type="gramStart"/>
+            <w:r>
+              <w:rPr>
+                <w:rFonts w:cs="Cambria"/>
+              </w:rPr>
+              <w:t>QueueOrder(</w:t>
+            </w:r>
+            <w:proofErr w:type="gramEnd"/>
+            <w:r>
+              <w:rPr>
+                <w:rFonts w:cs="Cambria"/>
+              </w:rPr>
+              <w:t xml:space="preserve">), </w:t>
+            </w:r>
+            <w:proofErr w:type="gramStart"/>
+            <w:r>
+              <w:rPr>
+                <w:rFonts w:cs="Cambria"/>
+              </w:rPr>
+              <w:t>ConfirmReady(</w:t>
+            </w:r>
+            <w:proofErr w:type="gramEnd"/>
+            <w:r>
+              <w:rPr>
+                <w:rFonts w:cs="Cambria"/>
+              </w:rPr>
+              <w:t>).</w:t>
+            </w:r>
+            <w:r>
+              <w:br/>
+            </w:r>
+            <w:r>
+              <w:rPr>
+                <w:rFonts w:cs="Cambria"/>
+              </w:rPr>
+              <w:t xml:space="preserve">b. SUB_WAR: Eksekusi simultan otomatis tanpa input pemain. Fungsi: </w:t>
+            </w:r>
+            <w:proofErr w:type="gramStart"/>
+            <w:r>
+              <w:rPr>
+                <w:rFonts w:cs="Cambria"/>
+              </w:rPr>
+              <w:t>ExecuteMoveSimultaneous(</w:t>
+            </w:r>
+            <w:proofErr w:type="gramEnd"/>
+            <w:r>
+              <w:rPr>
+                <w:rFonts w:cs="Cambria"/>
+              </w:rPr>
+              <w:t xml:space="preserve">), </w:t>
+            </w:r>
+            <w:proofErr w:type="gramStart"/>
+            <w:r>
+              <w:rPr>
+                <w:rFonts w:cs="Cambria"/>
+              </w:rPr>
+              <w:t>UpdateSightAndFoW(</w:t>
+            </w:r>
+            <w:proofErr w:type="gramEnd"/>
+            <w:r>
+              <w:rPr>
+                <w:rFonts w:cs="Cambria"/>
+              </w:rPr>
+              <w:t xml:space="preserve">), </w:t>
+            </w:r>
+            <w:proofErr w:type="gramStart"/>
+            <w:r>
+              <w:rPr>
+                <w:rFonts w:cs="Cambria"/>
+              </w:rPr>
+              <w:t>FireWeaponsSimultaneous(</w:t>
+            </w:r>
+            <w:proofErr w:type="gramEnd"/>
+            <w:r>
+              <w:rPr>
+                <w:rFonts w:cs="Cambria"/>
+              </w:rPr>
+              <w:t xml:space="preserve">), </w:t>
+            </w:r>
+            <w:proofErr w:type="gramStart"/>
+            <w:r>
+              <w:rPr>
+                <w:rFonts w:cs="Cambria"/>
+              </w:rPr>
+              <w:t>ResolveDamageAndCover(</w:t>
+            </w:r>
+            <w:proofErr w:type="gramEnd"/>
+            <w:r>
+              <w:rPr>
+                <w:rFonts w:cs="Cambria"/>
+              </w:rPr>
+              <w:t xml:space="preserve">), </w:t>
+            </w:r>
+            <w:proofErr w:type="gramStart"/>
+            <w:r>
+              <w:rPr>
+                <w:rFonts w:cs="Cambria"/>
+              </w:rPr>
+              <w:t>RemoveDestroyedUnits(</w:t>
+            </w:r>
+            <w:proofErr w:type="gramEnd"/>
+            <w:r>
+              <w:rPr>
+                <w:rFonts w:cs="Cambria"/>
+              </w:rPr>
+              <w:t xml:space="preserve">), </w:t>
+            </w:r>
+            <w:proofErr w:type="gramStart"/>
+            <w:r>
+              <w:rPr>
+                <w:rFonts w:cs="Cambria"/>
+              </w:rPr>
+              <w:t>RevealImpactArea(</w:t>
+            </w:r>
+            <w:proofErr w:type="gramEnd"/>
+            <w:r>
+              <w:rPr>
+                <w:rFonts w:cs="Cambria"/>
+              </w:rPr>
+              <w:t>).</w:t>
+            </w:r>
+            <w:r>
+              <w:br/>
+            </w:r>
+            <w:r>
+              <w:rPr>
+                <w:rFonts w:cs="Cambria"/>
+              </w:rPr>
+              <w:t xml:space="preserve">c. SUB_TURN_SUMMARY: Menghitung hasil pertempuran giliran. Fungsi: </w:t>
+            </w:r>
+            <w:proofErr w:type="gramStart"/>
+            <w:r>
+              <w:rPr>
+                <w:rFonts w:cs="Cambria"/>
+              </w:rPr>
+              <w:t>CalculateTurnCoins(</w:t>
+            </w:r>
+            <w:proofErr w:type="gramEnd"/>
+            <w:r>
+              <w:rPr>
+                <w:rFonts w:cs="Cambria"/>
+              </w:rPr>
+              <w:t xml:space="preserve">), </w:t>
+            </w:r>
+            <w:proofErr w:type="gramStart"/>
+            <w:r>
+              <w:rPr>
+                <w:rFonts w:cs="Cambria"/>
+              </w:rPr>
+              <w:t>OpenUpgradeStore(</w:t>
+            </w:r>
+            <w:proofErr w:type="gramEnd"/>
+            <w:r>
+              <w:rPr>
+                <w:rFonts w:cs="Cambria"/>
+              </w:rPr>
+              <w:t xml:space="preserve">), </w:t>
+            </w:r>
+            <w:proofErr w:type="gramStart"/>
+            <w:r>
+              <w:rPr>
+                <w:rFonts w:cs="Cambria"/>
+              </w:rPr>
+              <w:t>CheckWinLoseConditions(</w:t>
+            </w:r>
+            <w:proofErr w:type="gramEnd"/>
+            <w:r>
+              <w:rPr>
+                <w:rFonts w:cs="Cambria"/>
+              </w:rPr>
+              <w:t xml:space="preserve">), </w:t>
+            </w:r>
+            <w:proofErr w:type="gramStart"/>
+            <w:r>
+              <w:rPr>
+                <w:rFonts w:cs="Cambria"/>
+              </w:rPr>
+              <w:t>AdvanceToNextTurn(</w:t>
+            </w:r>
+            <w:proofErr w:type="gramEnd"/>
+            <w:r>
+              <w:rPr>
+                <w:rFonts w:cs="Cambria"/>
+              </w:rPr>
+              <w:t>).</w:t>
             </w:r>
           </w:p>
         </w:tc>
@@ -224,9 +713,27 @@
         <w:tc>
           <w:tcPr>
             <w:tcW w:w="4320" w:type="dxa"/>
+            <w:tcBorders>
+              <w:top w:val="single" w:sz="4" w:space="0" w:color="auto"/>
+              <w:left w:val="single" w:sz="4" w:space="0" w:color="auto"/>
+              <w:bottom w:val="single" w:sz="4" w:space="0" w:color="auto"/>
+              <w:right w:val="single" w:sz="4" w:space="0" w:color="auto"/>
+            </w:tcBorders>
+            <w:tcMar>
+              <w:top w:w="0" w:type="dxa"/>
+              <w:left w:w="108" w:type="dxa"/>
+              <w:bottom w:w="0" w:type="dxa"/>
+              <w:right w:w="108" w:type="dxa"/>
+            </w:tcMar>
           </w:tcPr>
           <w:p>
+            <w:pPr>
+              <w:spacing w:after="200" w:line="276" w:lineRule="auto"/>
+            </w:pPr>
             <w:r>
+              <w:rPr>
+                <w:rFonts w:cs="Cambria"/>
+              </w:rPr>
               <w:t>PAUSE_STATE</w:t>
             </w:r>
           </w:p>
@@ -234,10 +741,112 @@
         <w:tc>
           <w:tcPr>
             <w:tcW w:w="4320" w:type="dxa"/>
+            <w:tcBorders>
+              <w:top w:val="single" w:sz="4" w:space="0" w:color="auto"/>
+              <w:left w:val="single" w:sz="4" w:space="0" w:color="auto"/>
+              <w:bottom w:val="single" w:sz="4" w:space="0" w:color="auto"/>
+              <w:right w:val="single" w:sz="4" w:space="0" w:color="auto"/>
+            </w:tcBorders>
+            <w:tcMar>
+              <w:top w:w="0" w:type="dxa"/>
+              <w:left w:w="108" w:type="dxa"/>
+              <w:bottom w:w="0" w:type="dxa"/>
+              <w:right w:w="108" w:type="dxa"/>
+            </w:tcMar>
           </w:tcPr>
           <w:p>
+            <w:pPr>
+              <w:spacing w:after="200" w:line="276" w:lineRule="auto"/>
+            </w:pPr>
             <w:r>
-              <w:t>Game berhenti sementara. Fungsi: FreezeTime(), ShowPauseUI()</w:t>
+              <w:rPr>
+                <w:rFonts w:cs="Cambria"/>
+              </w:rPr>
+              <w:t xml:space="preserve">Membekukan logika update medan perang sementara saat pemain menekan Escape atau tombol jeda. Fungsi: </w:t>
+            </w:r>
+            <w:proofErr w:type="gramStart"/>
+            <w:r>
+              <w:rPr>
+                <w:rFonts w:cs="Cambria"/>
+              </w:rPr>
+              <w:t>FreezeGameplayTimer(</w:t>
+            </w:r>
+            <w:proofErr w:type="gramEnd"/>
+            <w:r>
+              <w:rPr>
+                <w:rFonts w:cs="Cambria"/>
+              </w:rPr>
+              <w:t xml:space="preserve">), </w:t>
+            </w:r>
+            <w:proofErr w:type="gramStart"/>
+            <w:r>
+              <w:rPr>
+                <w:rFonts w:cs="Cambria"/>
+              </w:rPr>
+              <w:t>RenderDimOverlay(</w:t>
+            </w:r>
+            <w:proofErr w:type="gramEnd"/>
+            <w:r>
+              <w:rPr>
+                <w:rFonts w:cs="Cambria"/>
+              </w:rPr>
+              <w:t xml:space="preserve">), </w:t>
+            </w:r>
+            <w:proofErr w:type="gramStart"/>
+            <w:r>
+              <w:rPr>
+                <w:rFonts w:cs="Cambria"/>
+              </w:rPr>
+              <w:t>ShowPauseMenu(</w:t>
+            </w:r>
+            <w:proofErr w:type="gramEnd"/>
+            <w:r>
+              <w:rPr>
+                <w:rFonts w:cs="Cambria"/>
+              </w:rPr>
+              <w:t xml:space="preserve">), </w:t>
+            </w:r>
+            <w:proofErr w:type="gramStart"/>
+            <w:r>
+              <w:rPr>
+                <w:rFonts w:cs="Cambria"/>
+              </w:rPr>
+              <w:t>ResumeBattle(</w:t>
+            </w:r>
+            <w:proofErr w:type="gramEnd"/>
+            <w:r>
+              <w:rPr>
+                <w:rFonts w:cs="Cambria"/>
+              </w:rPr>
+              <w:t xml:space="preserve">), </w:t>
+            </w:r>
+            <w:proofErr w:type="gramStart"/>
+            <w:r>
+              <w:rPr>
+                <w:rFonts w:cs="Cambria"/>
+              </w:rPr>
+              <w:t>RestartMatch(</w:t>
+            </w:r>
+            <w:proofErr w:type="gramEnd"/>
+            <w:r>
+              <w:rPr>
+                <w:rFonts w:cs="Cambria"/>
+              </w:rPr>
+              <w:t xml:space="preserve">), </w:t>
+            </w:r>
+            <w:proofErr w:type="gramStart"/>
+            <w:r>
+              <w:rPr>
+                <w:rFonts w:cs="Cambria"/>
+              </w:rPr>
+              <w:t>QuitToMainMenu(</w:t>
+            </w:r>
+            <w:proofErr w:type="gramEnd"/>
+            <w:r>
+              <w:rPr>
+                <w:rFonts w:cs="Cambria"/>
+              </w:rPr>
+              <w:t>).</w:t>
             </w:r>
           </w:p>
         </w:tc>
@@ -246,20 +855,133 @@
         <w:tc>
           <w:tcPr>
             <w:tcW w:w="4320" w:type="dxa"/>
+            <w:tcBorders>
+              <w:top w:val="single" w:sz="4" w:space="0" w:color="auto"/>
+              <w:left w:val="single" w:sz="4" w:space="0" w:color="auto"/>
+              <w:bottom w:val="single" w:sz="4" w:space="0" w:color="auto"/>
+              <w:right w:val="single" w:sz="4" w:space="0" w:color="auto"/>
+            </w:tcBorders>
+            <w:tcMar>
+              <w:top w:w="0" w:type="dxa"/>
+              <w:left w:w="108" w:type="dxa"/>
+              <w:bottom w:w="0" w:type="dxa"/>
+              <w:right w:w="108" w:type="dxa"/>
+            </w:tcMar>
           </w:tcPr>
           <w:p>
+            <w:pPr>
+              <w:spacing w:after="200" w:line="276" w:lineRule="auto"/>
+            </w:pPr>
             <w:r>
-              <w:t>END_STATE</w:t>
+              <w:rPr>
+                <w:rFonts w:cs="Cambria"/>
+              </w:rPr>
+              <w:t>END_STATE (VICTORY / DEFEAT)</w:t>
             </w:r>
           </w:p>
         </w:tc>
         <w:tc>
           <w:tcPr>
             <w:tcW w:w="4320" w:type="dxa"/>
+            <w:tcBorders>
+              <w:top w:val="single" w:sz="4" w:space="0" w:color="auto"/>
+              <w:left w:val="single" w:sz="4" w:space="0" w:color="auto"/>
+              <w:bottom w:val="single" w:sz="4" w:space="0" w:color="auto"/>
+              <w:right w:val="single" w:sz="4" w:space="0" w:color="auto"/>
+            </w:tcBorders>
+            <w:tcMar>
+              <w:top w:w="0" w:type="dxa"/>
+              <w:left w:w="108" w:type="dxa"/>
+              <w:bottom w:w="0" w:type="dxa"/>
+              <w:right w:w="108" w:type="dxa"/>
+            </w:tcMar>
           </w:tcPr>
           <w:p>
+            <w:pPr>
+              <w:spacing w:after="200" w:line="276" w:lineRule="auto"/>
+            </w:pPr>
             <w:r>
-              <w:t>Kondisi menang atau kalah. Fungsi: CalculateFinalScore(), ShowEndingScreen()</w:t>
+              <w:rPr>
+                <w:rFonts w:cs="Cambria"/>
+              </w:rPr>
+              <w:t xml:space="preserve">Kondisi permainan selesai ketika salah satu pihak tereleminasi penuh atau batas 25 giliran tercapai. Fungsi: </w:t>
+            </w:r>
+            <w:proofErr w:type="gramStart"/>
+            <w:r>
+              <w:rPr>
+                <w:rFonts w:cs="Cambria"/>
+              </w:rPr>
+              <w:t>ShowVictoryFanfare(</w:t>
+            </w:r>
+            <w:proofErr w:type="gramEnd"/>
+            <w:r>
+              <w:rPr>
+                <w:rFonts w:cs="Cambria"/>
+              </w:rPr>
+              <w:t xml:space="preserve">), </w:t>
+            </w:r>
+            <w:proofErr w:type="gramStart"/>
+            <w:r>
+              <w:rPr>
+                <w:rFonts w:cs="Cambria"/>
+              </w:rPr>
+              <w:t>ShowDefeatScreen(</w:t>
+            </w:r>
+            <w:proofErr w:type="gramEnd"/>
+            <w:r>
+              <w:rPr>
+                <w:rFonts w:cs="Cambria"/>
+              </w:rPr>
+              <w:t xml:space="preserve">), </w:t>
+            </w:r>
+            <w:proofErr w:type="gramStart"/>
+            <w:r>
+              <w:rPr>
+                <w:rFonts w:cs="Cambria"/>
+              </w:rPr>
+              <w:t>DisplayMatchAnalytics(</w:t>
+            </w:r>
+            <w:proofErr w:type="gramEnd"/>
+            <w:r>
+              <w:rPr>
+                <w:rFonts w:cs="Cambria"/>
+              </w:rPr>
+              <w:t xml:space="preserve">Turns, UnitsLost, </w:t>
+            </w:r>
+            <w:r>
+              <w:rPr>
+                <w:rFonts w:cs="Cambria"/>
+              </w:rPr>
+              <w:lastRenderedPageBreak/>
+              <w:t xml:space="preserve">Coins, FoWRevealed), </w:t>
+            </w:r>
+            <w:proofErr w:type="gramStart"/>
+            <w:r>
+              <w:rPr>
+                <w:rFonts w:cs="Cambria"/>
+              </w:rPr>
+              <w:t>RestartRematch(</w:t>
+            </w:r>
+            <w:proofErr w:type="gramEnd"/>
+            <w:r>
+              <w:rPr>
+                <w:rFonts w:cs="Cambria"/>
+              </w:rPr>
+              <w:t xml:space="preserve">), </w:t>
+            </w:r>
+            <w:proofErr w:type="gramStart"/>
+            <w:r>
+              <w:rPr>
+                <w:rFonts w:cs="Cambria"/>
+              </w:rPr>
+              <w:t>ReturnToMenu(</w:t>
+            </w:r>
+            <w:proofErr w:type="gramEnd"/>
+            <w:r>
+              <w:rPr>
+                <w:rFonts w:cs="Cambria"/>
+              </w:rPr>
+              <w:t>).</w:t>
             </w:r>
           </w:p>
         </w:tc>
@@ -271,12 +993,18 @@
         <w:pStyle w:val="Heading1"/>
       </w:pPr>
       <w:r>
+        <w:rPr>
+          <w:rFonts w:cs="Calibri"/>
+        </w:rPr>
         <w:t>2. Struktur Kelas, Objek, &amp; UI</w:t>
       </w:r>
     </w:p>
     <w:p>
       <w:r>
-        <w:t>Struktur pemrograman menggunakan konsep Object-Oriented Programming (OOP) atau Entity Component System (ECS). Semua objek turunan memiliki komponen dasar seperti Transform (posisi X,Y/Z), Sprite/Model (visual), Collider (area benturan), dan Audio.</w:t>
+        <w:rPr>
+          <w:rFonts w:cs="Cambria"/>
+        </w:rPr>
+        <w:t>Struktur pemrograman mengadopsi konsep Object-Oriented Programming (OOP) modular yang memisahkan model logika murni dari rendering grafis Pygame agar dapat diuji menggunakan automated test (Pytest). Setiap objek medan perang merupakan turunan dari kelas dasar Entity dengan komponen posisi grid (grid_x, grid_y), dimensi tile footprint, penanda tim (Team.PLAYER / Team.AI), collider logika tile, dan representasi visual geometris.</w:t>
       </w:r>
     </w:p>
     <w:p>
@@ -284,8 +1012,10 @@
         <w:pStyle w:val="Heading2"/>
       </w:pPr>
       <w:r>
-        <w:lastRenderedPageBreak/>
-        <w:t>Daftar Kelas dan Objek Utama:</w:t>
+        <w:rPr>
+          <w:rFonts w:cs="Calibri"/>
+        </w:rPr>
+        <w:t>Daftar Kelas, Objek Utama, &amp; Komponen:</w:t>
       </w:r>
     </w:p>
     <w:p>
@@ -293,7 +1023,28 @@
         <w:pStyle w:val="ListBullet"/>
       </w:pPr>
       <w:r>
-        <w:t>Playable Character: Memiliki komponen Animator, Health/Stamina, dan input controller. Fungsi utama: Move(), Action/Attack(), TakeDamage().</w:t>
+        <w:rPr>
+          <w:rFonts w:cs="Cambria"/>
+        </w:rPr>
+        <w:t>1. Playable Character (PlayerUnit - Subclass dari BaseUnit):</w:t>
+      </w:r>
+      <w:r>
+        <w:br/>
+      </w:r>
+      <w:r>
+        <w:rPr>
+          <w:rFonts w:cs="Cambria"/>
+        </w:rPr>
+        <w:t xml:space="preserve">   - Komponen: UnitType (Pistol, Machine Gun, Sniper, Tank, Mortar, Artillery), HealthComponent (current_hp, max_hp), MovementComponent (move_range, terrain_cost_evaluator), WeaponComponent (attack_range, base_damage, aoe_radius, penetration_mod), CommandQueueSlot (menyimpan 1 perintah aktif MOVE/ATTACK per giliran), dan UpgradeWallet.</w:t>
+      </w:r>
+      <w:r>
+        <w:br/>
+      </w:r>
+      <w:r>
+        <w:rPr>
+          <w:rFonts w:cs="Cambria"/>
+        </w:rPr>
+        <w:t xml:space="preserve">   - Fungsi Utama: Select(), SetMoveTarget(tile), SetAttackTarget(coord_x, coord_y), ValidateRange(), ConfirmOrder(), ReceiveDamage(amount, terrain), Destroy().</w:t>
       </w:r>
     </w:p>
     <w:p>
@@ -301,7 +1052,28 @@
         <w:pStyle w:val="ListBullet"/>
       </w:pPr>
       <w:r>
-        <w:t>Enemy / Obstacle: Memiliki komponen AI/NavMesh (untuk musuh) atau Collider/Trigger (untuk rintangan). Fungsi utama: Patrol(), OnCollisionEnter().</w:t>
+        <w:rPr>
+          <w:rFonts w:cs="Cambria"/>
+        </w:rPr>
+        <w:t>2. Enemy / Opponent (EnemyUnit - Subclass dari BaseUnit) &amp; Rule-Based AI Controller:</w:t>
+      </w:r>
+      <w:r>
+        <w:br/>
+      </w:r>
+      <w:r>
+        <w:rPr>
+          <w:rFonts w:cs="Cambria"/>
+        </w:rPr>
+        <w:t xml:space="preserve">   - Komponen: AI Knowledge Memory (visible_player_units, last_known_positions, danger_heatmap, strategic_waypoints), FSM Decision Brain (Search/Patrol State, Combat Engagement State, Blind Bombardment Prediction State), dan parameter tempur identik dengan unit kawan demi asas keadilan taktis.</w:t>
+      </w:r>
+      <w:r>
+        <w:br/>
+      </w:r>
+      <w:r>
+        <w:rPr>
+          <w:rFonts w:cs="Cambria"/>
+        </w:rPr>
+        <w:t xml:space="preserve">   - Fungsi Utama: UpdateVision(FoW), PrioritizeTargetScoring(HP, threat, distance), PlanTurnOrders(), IssueSimultaneousCommands(). AI beroperasi di bawah kepatuhan mutlak aturan Fog of War (tidak curang membaca koordinat tersembunyi).</w:t>
       </w:r>
     </w:p>
     <w:p>
@@ -309,23 +1081,70 @@
         <w:pStyle w:val="ListBullet"/>
       </w:pPr>
       <w:r>
-        <w:t xml:space="preserve">Environment: </w:t>
+        <w:rPr>
+          <w:rFonts w:cs="Cambria"/>
+        </w:rPr>
+        <w:t>3. Environment &amp; Battlefield Grid (BattlefieldGrid &amp; FogOfWarManager):</w:t>
       </w:r>
-      <w:proofErr w:type="spellStart"/>
       <w:r>
-        <w:t>Tembok</w:t>
+        <w:br/>
       </w:r>
-      <w:proofErr w:type="spellEnd"/>
       <w:r>
-        <w:t xml:space="preserve">, </w:t>
+        <w:rPr>
+          <w:rFonts w:cs="Cambria"/>
+        </w:rPr>
+        <w:t xml:space="preserve">   - Komponen: Matriks 2D berukuran 24 x 16 tile (skala 40x40 piksel per tile). </w:t>
       </w:r>
-      <w:proofErr w:type="spellStart"/>
       <w:r>
-        <w:t>lantai</w:t>
+        <w:br/>
       </w:r>
-      <w:proofErr w:type="spellEnd"/>
       <w:r>
-        <w:t>, area aman (statis).</w:t>
+        <w:rPr>
+          <w:rFonts w:cs="Cambria"/>
+        </w:rPr>
+        <w:t xml:space="preserve">   - Fog of War Grid: Mengelola status visibilitas per tile (UNEXPLORED, EXPLORED/FOGGED, VISIBLE). Menyediakan fungsi </w:t>
+      </w:r>
+      <w:proofErr w:type="gramStart"/>
+      <w:r>
+        <w:rPr>
+          <w:rFonts w:cs="Cambria"/>
+        </w:rPr>
+        <w:t>RaycastVision(</w:t>
+      </w:r>
+      <w:proofErr w:type="gramEnd"/>
+      <w:r>
+        <w:rPr>
+          <w:rFonts w:cs="Cambria"/>
+        </w:rPr>
+        <w:t xml:space="preserve">unit, sight_range), </w:t>
+      </w:r>
+      <w:proofErr w:type="gramStart"/>
+      <w:r>
+        <w:rPr>
+          <w:rFonts w:cs="Cambria"/>
+        </w:rPr>
+        <w:t>RevealImpactArea(</w:t>
+      </w:r>
+      <w:proofErr w:type="gramEnd"/>
+      <w:r>
+        <w:rPr>
+          <w:rFonts w:cs="Cambria"/>
+        </w:rPr>
+        <w:t xml:space="preserve">center_x, center_y, radius=3x3), dan </w:t>
+      </w:r>
+      <w:proofErr w:type="gramStart"/>
+      <w:r>
+        <w:rPr>
+          <w:rFonts w:cs="Cambria"/>
+        </w:rPr>
+        <w:t>IsTileVisibleToTeam(</w:t>
+      </w:r>
+      <w:proofErr w:type="gramEnd"/>
+      <w:r>
+        <w:rPr>
+          <w:rFonts w:cs="Cambria"/>
+        </w:rPr>
+        <w:t>team, x, y).</w:t>
       </w:r>
     </w:p>
     <w:p>
@@ -333,7 +1152,10 @@
         <w:pStyle w:val="Heading2"/>
       </w:pPr>
       <w:r>
-        <w:t>Elemen UI &amp; Syarat Penyelesaian (Menang/Kalah):</w:t>
+        <w:rPr>
+          <w:rFonts w:cs="Calibri"/>
+        </w:rPr>
+        <w:t>Elemen UI, Mekanisme Interaksi, &amp; Syarat Penyelesaian (Menang/Kalah):</w:t>
       </w:r>
     </w:p>
     <w:p>
@@ -341,23 +1163,53 @@
         <w:pStyle w:val="ListBullet"/>
       </w:pPr>
       <w:r>
-        <w:t xml:space="preserve">Status </w:t>
+        <w:rPr>
+          <w:rFonts w:cs="Cambria"/>
+        </w:rPr>
+        <w:t>Elemen UI &amp; Status Indikator (HUD Taktis 1280 x 720 piksel (720p)):</w:t>
       </w:r>
-      <w:proofErr w:type="spellStart"/>
       <w:r>
-        <w:t>Indikator</w:t>
+        <w:br/>
       </w:r>
-      <w:proofErr w:type="spellEnd"/>
       <w:r>
-        <w:t xml:space="preserve"> (Health/Stamina/Resource): </w:t>
+        <w:rPr>
+          <w:rFonts w:cs="Cambria"/>
+        </w:rPr>
+        <w:t>- Header Status Atas: Menampilkan Turn Counter (misal: 'TURN: 04 / 25'), Banner Fase Dinamis (Kuning saat Planning Phase, Merah saat War Phase), Indikator Koin Operasional, dan Penghitung Unit Aktif Kawan vs Sisa Musuh Teridentifikasi.</w:t>
       </w:r>
-      <w:proofErr w:type="spellStart"/>
       <w:r>
-        <w:t>Menampilkan</w:t>
+        <w:br/>
       </w:r>
-      <w:proofErr w:type="spellEnd"/>
       <w:r>
-        <w:t xml:space="preserve"> kondisi pemain. Syarat Kalah: Indikator mencapai 0.</w:t>
+        <w:rPr>
+          <w:rFonts w:cs="Cambria"/>
+        </w:rPr>
+        <w:t xml:space="preserve">- Inspector Panel (Samping Kanan): Menampilkan profil detail unit yang dipilih (Nama unit, Health Bar dinamis 3-warna [Hijau &gt;50%, Kuning 25-50%, Merah &lt;=25%], Move </w:t>
+      </w:r>
+      <w:r>
+        <w:rPr>
+          <w:rFonts w:cs="Cambria"/>
+        </w:rPr>
+        <w:lastRenderedPageBreak/>
+        <w:t>Range, Attack Range, AoE info, serta tombol aksi MOVE, ATTACK, SCAN).</w:t>
+      </w:r>
+      <w:r>
+        <w:br/>
+      </w:r>
+      <w:r>
+        <w:rPr>
+          <w:rFonts w:cs="Cambria"/>
+        </w:rPr>
+        <w:t>- Panel Input Koordinat Manual: Kotak pengetikan koordinat angka (X, Y) atau alfanumerik (misal: 'H8') untuk mengunci sasaran tembak tanpa klik langsung di peta perang (mempertegas tema penargetan koordinat peta perang kertas), dilengkapi lampu validasi instan (Hijau jika sah, Merah jika di luar jangkauan).</w:t>
+      </w:r>
+      <w:r>
+        <w:br/>
+      </w:r>
+      <w:r>
+        <w:rPr>
+          <w:rFonts w:cs="Cambria"/>
+        </w:rPr>
+        <w:t>- Panel Antrean Perintah: Daftar ringkas aksi unit yang siap dieksekusi dengan tombol batalkan (undo) sebelum menekan tombol [READY / SELESAI].</w:t>
       </w:r>
     </w:p>
     <w:p>
@@ -365,47 +1217,91 @@
         <w:pStyle w:val="ListBullet"/>
       </w:pPr>
       <w:r>
-        <w:t xml:space="preserve">Objective Tracker (Score/Time/Quest): </w:t>
+        <w:rPr>
+          <w:rFonts w:cs="Cambria"/>
+        </w:rPr>
+        <w:t>Sistem Ekonomi Koin &amp; Upgrade Toko Giliran (Turn Reward System):</w:t>
+      </w:r>
+      <w:r>
+        <w:br/>
+      </w:r>
+      <w:r>
+        <w:rPr>
+          <w:rFonts w:cs="Cambria"/>
+        </w:rPr>
+        <w:t>- Setelah War Phase selesai, pemain memperoleh koin berdasarkan evaluasi: Base Turn Income (+50 koin), Bonus Eliminasi Unit Lawan (+25 Pistol, +40 Sniper/MG, +75 Tank/Mortar/Artillery)</w:t>
+      </w:r>
+      <w:r>
+        <w:rPr>
+          <w:rFonts w:cs="Cambria"/>
+        </w:rPr>
+        <w:t>.</w:t>
+      </w:r>
+      <w:r>
+        <w:t xml:space="preserve"> </w:t>
+      </w:r>
+      <w:r>
+        <w:br/>
+      </w:r>
+      <w:r>
+        <w:rPr>
+          <w:rFonts w:cs="Cambria"/>
+        </w:rPr>
+        <w:t xml:space="preserve">- Koin </w:t>
       </w:r>
       <w:proofErr w:type="spellStart"/>
       <w:r>
-        <w:t>Menampilkan</w:t>
+        <w:rPr>
+          <w:rFonts w:cs="Cambria"/>
+        </w:rPr>
+        <w:t>dapat</w:t>
       </w:r>
       <w:proofErr w:type="spellEnd"/>
       <w:r>
-        <w:t xml:space="preserve"> progres penyelesaian. Syarat Menang: Mencapai target </w:t>
+        <w:rPr>
+          <w:rFonts w:cs="Cambria"/>
+        </w:rPr>
+        <w:t xml:space="preserve"> dibelanjakan pada akhir giliran untuk membeli upgrade permanen: Penetration Shells (+15% Damage dasar), Extended Scope (+2 Tile Attack Range), High-Capacity Magazine (</w:t>
+      </w:r>
+      <w:r>
+        <w:rPr>
+          <w:rFonts w:cs="Cambria"/>
+        </w:rPr>
+        <w:t>+1 extra attack</w:t>
+      </w:r>
+      <w:r>
+        <w:rPr>
+          <w:rFonts w:cs="Cambria"/>
+        </w:rPr>
+        <w:t xml:space="preserve">), </w:t>
       </w:r>
       <w:proofErr w:type="spellStart"/>
       <w:r>
-        <w:t>skor</w:t>
+        <w:rPr>
+          <w:rFonts w:cs="Cambria"/>
+        </w:rPr>
+        <w:t>atau</w:t>
       </w:r>
       <w:proofErr w:type="spellEnd"/>
       <w:r>
-        <w:t>/</w:t>
+        <w:rPr>
+          <w:rFonts w:cs="Cambria"/>
+        </w:rPr>
+        <w:t xml:space="preserve"> item </w:t>
       </w:r>
       <w:proofErr w:type="spellStart"/>
       <w:r>
-        <w:t>waktu</w:t>
+        <w:rPr>
+          <w:rFonts w:cs="Cambria"/>
+        </w:rPr>
+        <w:t>khusus</w:t>
       </w:r>
       <w:proofErr w:type="spellEnd"/>
       <w:r>
-        <w:t>/</w:t>
-      </w:r>
-      <w:proofErr w:type="spellStart"/>
-      <w:r>
-        <w:t>tujuan</w:t>
-      </w:r>
-      <w:proofErr w:type="spellEnd"/>
-      <w:r>
-        <w:t xml:space="preserve"> </w:t>
-      </w:r>
-      <w:proofErr w:type="spellStart"/>
-      <w:r>
-        <w:t>akhir</w:t>
-      </w:r>
-      <w:proofErr w:type="spellEnd"/>
-      <w:r>
-        <w:t xml:space="preserve"> level.</w:t>
+        <w:rPr>
+          <w:rFonts w:cs="Cambria"/>
+        </w:rPr>
+        <w:t xml:space="preserve"> Scan Drone (membuka area 5x5 tile di koordinat mana pun).</w:t>
       </w:r>
     </w:p>
     <w:p>
@@ -413,286 +1309,185 @@
         <w:pStyle w:val="ListBullet"/>
       </w:pPr>
       <w:r>
-        <w:t xml:space="preserve">Bagian </w:t>
+        <w:rPr>
+          <w:rFonts w:cs="Cambria"/>
+        </w:rPr>
+        <w:t>Detail Aturan Permainan &amp; Syarat Penyelesaian Kuantitatif (Syarat Menang/Kalah):</w:t>
       </w:r>
-      <w:proofErr w:type="spellStart"/>
       <w:r>
-        <w:t>ini</w:t>
+        <w:br/>
       </w:r>
-      <w:proofErr w:type="spellEnd"/>
       <w:r>
-        <w:t xml:space="preserve"> </w:t>
+        <w:rPr>
+          <w:rFonts w:cs="Cambria"/>
+        </w:rPr>
+        <w:t>1. Syarat Kemenangan Mutlak (VICTORY):</w:t>
       </w:r>
-      <w:proofErr w:type="spellStart"/>
       <w:r>
-        <w:t>dijelaskan</w:t>
+        <w:br/>
       </w:r>
-      <w:proofErr w:type="spellEnd"/>
       <w:r>
-        <w:t xml:space="preserve"> </w:t>
+        <w:rPr>
+          <w:rFonts w:cs="Cambria"/>
+        </w:rPr>
+        <w:t xml:space="preserve">   - Pemain berhasil mengeliminasi seluruh pasukan lawan (Total Enemy Units Remaining = 0) dari medan perang.</w:t>
       </w:r>
-      <w:proofErr w:type="spellStart"/>
       <w:r>
-        <w:t>lebih</w:t>
+        <w:br/>
       </w:r>
-      <w:proofErr w:type="spellEnd"/>
       <w:r>
-        <w:t xml:space="preserve"> detail </w:t>
+        <w:rPr>
+          <w:rFonts w:cs="Cambria"/>
+        </w:rPr>
+        <w:t xml:space="preserve">   - Mengantarkan ke Victory Screen yang menampilkan rekap statistik (jumlah giliran tempur, sisa pasukan, total koin yang diraih, dan persentase pembukaan peta kabut perang).</w:t>
       </w:r>
-      <w:proofErr w:type="spellStart"/>
       <w:r>
-        <w:t>sesuai</w:t>
+        <w:br/>
       </w:r>
-      <w:proofErr w:type="spellEnd"/>
       <w:r>
-        <w:t xml:space="preserve"> </w:t>
+        <w:rPr>
+          <w:rFonts w:cs="Cambria"/>
+        </w:rPr>
+        <w:t>2. Syarat Kekalahan Mutlak (DEFEAT / GAME OVER):</w:t>
       </w:r>
-      <w:proofErr w:type="spellStart"/>
       <w:r>
-        <w:t>aturan</w:t>
+        <w:br/>
       </w:r>
-      <w:proofErr w:type="spellEnd"/>
       <w:r>
-        <w:t xml:space="preserve"> </w:t>
+        <w:rPr>
+          <w:rFonts w:cs="Cambria"/>
+        </w:rPr>
+        <w:t xml:space="preserve">   - Kondisi A: Seluruh unit pasukan pemain musnah dihancurkan lawan (Total Player Units Remaining = 0).</w:t>
       </w:r>
-      <w:proofErr w:type="spellStart"/>
       <w:r>
-        <w:t>permainan</w:t>
+        <w:br/>
       </w:r>
-      <w:proofErr w:type="spellEnd"/>
       <w:r>
-        <w:t xml:space="preserve">. </w:t>
+        <w:rPr>
+          <w:rFonts w:cs="Cambria"/>
+        </w:rPr>
+        <w:t xml:space="preserve">   - Kondisi B: Batas maksimal giliran tercapai (Turn &gt; 25) sebelum seluruh lawan dieliminasi (Kekalahan kehabisan logistik perang).</w:t>
       </w:r>
-      <w:proofErr w:type="spellStart"/>
       <w:r>
-        <w:t>Misalnya</w:t>
+        <w:br/>
       </w:r>
-      <w:proofErr w:type="spellEnd"/>
       <w:r>
-        <w:t xml:space="preserve"> </w:t>
+        <w:rPr>
+          <w:rFonts w:cs="Cambria"/>
+        </w:rPr>
+        <w:t>3. Detail Aturan Kerusakan, Jangkauan, &amp; Karakteristik Unit:</w:t>
       </w:r>
-      <w:proofErr w:type="spellStart"/>
       <w:r>
-        <w:t>jelaskan</w:t>
+        <w:br/>
       </w:r>
-      <w:proofErr w:type="spellEnd"/>
       <w:r>
-        <w:t xml:space="preserve"> </w:t>
+        <w:rPr>
+          <w:rFonts w:cs="Cambria"/>
+        </w:rPr>
+        <w:t xml:space="preserve">   - Pistol: HP 70, Move 4 tile, Attack Range 6 tile, Damage 25 (Single tile).</w:t>
       </w:r>
-      <w:proofErr w:type="spellStart"/>
       <w:r>
-        <w:t>bagaimana</w:t>
+        <w:br/>
       </w:r>
-      <w:proofErr w:type="spellEnd"/>
       <w:r>
-        <w:t xml:space="preserve"> </w:t>
+        <w:rPr>
+          <w:rFonts w:cs="Cambria"/>
+        </w:rPr>
+        <w:t xml:space="preserve">   - Machine Gun: HP 90, Move 3 tile, Attack Range 8 tile, Damage 20 (Area AoE 3x3: pusat 100%, 8 tile sekitar 50%).</w:t>
       </w:r>
-      <w:proofErr w:type="spellStart"/>
       <w:r>
-        <w:t>syarat</w:t>
+        <w:br/>
       </w:r>
-      <w:proofErr w:type="spellEnd"/>
       <w:r>
-        <w:t xml:space="preserve"> </w:t>
+        <w:rPr>
+          <w:rFonts w:cs="Cambria"/>
+        </w:rPr>
+        <w:t xml:space="preserve">   - Sniper: HP 60, Move 2 tile, Attack Range 12 tile, Damage 60 (Single tile, spesialis pembunuh infanteri/artileri).</w:t>
       </w:r>
-      <w:proofErr w:type="spellStart"/>
       <w:r>
-        <w:t>menang</w:t>
+        <w:br/>
       </w:r>
-      <w:proofErr w:type="spellEnd"/>
       <w:r>
-        <w:t xml:space="preserve"> </w:t>
+        <w:rPr>
+          <w:rFonts w:cs="Cambria"/>
+        </w:rPr>
+        <w:t xml:space="preserve">   - Tank: HP 200, Move 3 tile, Attack Range 15 tile, Damage 50 (AoE 3x3, armor reduksi 10%, ukuran fisik 2x3 tile).</w:t>
       </w:r>
-      <w:proofErr w:type="spellStart"/>
       <w:r>
-        <w:t>yaitu</w:t>
+        <w:br/>
       </w:r>
-      <w:proofErr w:type="spellEnd"/>
       <w:r>
-        <w:t xml:space="preserve"> </w:t>
+        <w:rPr>
+          <w:rFonts w:cs="Cambria"/>
+        </w:rPr>
+        <w:t xml:space="preserve">   - Mortar: HP 100, Move 2 tile, Attack Range 18 tile, Damage 40 (AoE 3x3, lintasan lengkung melompati rintangan).</w:t>
       </w:r>
-      <w:proofErr w:type="spellStart"/>
       <w:r>
-        <w:t>mengalahkan</w:t>
+        <w:br/>
       </w:r>
-      <w:proofErr w:type="spellEnd"/>
       <w:r>
-        <w:t xml:space="preserve"> 10 </w:t>
+        <w:rPr>
+          <w:rFonts w:cs="Cambria"/>
+        </w:rPr>
+        <w:t xml:space="preserve">   - Artillery: HP 120, Move 1 tile, Attack Range 25 tile, Damage 75 (AoE 3x3, penghancur jarak jauh pembuka kabut perang).</w:t>
       </w:r>
-      <w:proofErr w:type="spellStart"/>
       <w:r>
-        <w:t>musuh</w:t>
+        <w:br/>
       </w:r>
-      <w:proofErr w:type="spellEnd"/>
       <w:r>
-        <w:t xml:space="preserve"> dan 1 boss. Dimana </w:t>
-      </w:r>
-      <w:proofErr w:type="spellStart"/>
-      <w:r>
-        <w:t>musuh</w:t>
-      </w:r>
-      <w:proofErr w:type="spellEnd"/>
-      <w:r>
-        <w:t xml:space="preserve"> </w:t>
-      </w:r>
-      <w:proofErr w:type="spellStart"/>
-      <w:r>
-        <w:t>biasa</w:t>
-      </w:r>
-      <w:proofErr w:type="spellEnd"/>
-      <w:r>
-        <w:t xml:space="preserve"> </w:t>
-      </w:r>
-      <w:proofErr w:type="spellStart"/>
-      <w:r>
-        <w:t>HPnya</w:t>
-      </w:r>
-      <w:proofErr w:type="spellEnd"/>
-      <w:r>
-        <w:t xml:space="preserve"> 100 </w:t>
-      </w:r>
-      <w:proofErr w:type="spellStart"/>
-      <w:r>
-        <w:t>sedangkan</w:t>
-      </w:r>
-      <w:proofErr w:type="spellEnd"/>
-      <w:r>
-        <w:t xml:space="preserve"> boss 500. </w:t>
-      </w:r>
-      <w:proofErr w:type="spellStart"/>
-      <w:r>
-        <w:t>Musuh</w:t>
-      </w:r>
-      <w:proofErr w:type="spellEnd"/>
-      <w:r>
-        <w:t xml:space="preserve"> </w:t>
-      </w:r>
-      <w:proofErr w:type="spellStart"/>
-      <w:r>
-        <w:t>bisa</w:t>
-      </w:r>
-      <w:proofErr w:type="spellEnd"/>
-      <w:r>
-        <w:t xml:space="preserve"> </w:t>
-      </w:r>
-      <w:proofErr w:type="spellStart"/>
-      <w:r>
-        <w:t>dikalahkan</w:t>
-      </w:r>
-      <w:proofErr w:type="spellEnd"/>
-      <w:r>
-        <w:t xml:space="preserve"> </w:t>
-      </w:r>
-      <w:proofErr w:type="spellStart"/>
-      <w:r>
-        <w:t>dengan</w:t>
-      </w:r>
-      <w:proofErr w:type="spellEnd"/>
-      <w:r>
-        <w:t xml:space="preserve"> </w:t>
-      </w:r>
-      <w:proofErr w:type="spellStart"/>
-      <w:r>
-        <w:t>tembakan</w:t>
-      </w:r>
-      <w:proofErr w:type="spellEnd"/>
-      <w:r>
-        <w:t xml:space="preserve"> </w:t>
-      </w:r>
-      <w:proofErr w:type="spellStart"/>
-      <w:r>
-        <w:t>biasa</w:t>
-      </w:r>
-      <w:proofErr w:type="spellEnd"/>
-      <w:r>
-        <w:t xml:space="preserve"> </w:t>
-      </w:r>
-      <w:proofErr w:type="spellStart"/>
-      <w:r>
-        <w:t>tetapi</w:t>
-      </w:r>
-      <w:proofErr w:type="spellEnd"/>
-      <w:r>
-        <w:t xml:space="preserve"> boss </w:t>
-      </w:r>
-      <w:proofErr w:type="spellStart"/>
-      <w:r>
-        <w:t>harus</w:t>
-      </w:r>
-      <w:proofErr w:type="spellEnd"/>
-      <w:r>
-        <w:t xml:space="preserve"> </w:t>
-      </w:r>
-      <w:proofErr w:type="spellStart"/>
-      <w:r>
-        <w:t>menggunakan</w:t>
-      </w:r>
-      <w:proofErr w:type="spellEnd"/>
-      <w:r>
-        <w:t xml:space="preserve"> item yang </w:t>
-      </w:r>
-      <w:proofErr w:type="spellStart"/>
-      <w:r>
-        <w:t>didapat</w:t>
-      </w:r>
-      <w:proofErr w:type="spellEnd"/>
-      <w:r>
-        <w:t xml:space="preserve"> Ketika </w:t>
-      </w:r>
-      <w:proofErr w:type="spellStart"/>
-      <w:r>
-        <w:t>mengalahkan</w:t>
-      </w:r>
-      <w:proofErr w:type="spellEnd"/>
-      <w:r>
-        <w:t xml:space="preserve"> </w:t>
-      </w:r>
-      <w:proofErr w:type="spellStart"/>
-      <w:r>
-        <w:t>musuh</w:t>
-      </w:r>
-      <w:proofErr w:type="spellEnd"/>
-      <w:r>
-        <w:t xml:space="preserve"> </w:t>
-      </w:r>
-      <w:proofErr w:type="spellStart"/>
-      <w:r>
-        <w:t>ke</w:t>
-      </w:r>
-      <w:proofErr w:type="spellEnd"/>
-      <w:r>
-        <w:t xml:space="preserve"> 8.</w:t>
+        <w:rPr>
+          <w:rFonts w:cs="Cambria"/>
+        </w:rPr>
+        <w:t xml:space="preserve">   - Setiap serangan AoE yang mendarat di koordinat target otomatis menghilangkan Fog of War pada area 3x3 di sekelilingnya.</w:t>
       </w:r>
     </w:p>
     <w:p>
-      <w:r>
-        <w:br w:type="page"/>
-      </w:r>
+      <w:pPr>
+        <w:pageBreakBefore/>
+      </w:pPr>
     </w:p>
     <w:p>
       <w:pPr>
         <w:pStyle w:val="Heading1"/>
       </w:pPr>
       <w:r>
-        <w:lastRenderedPageBreak/>
+        <w:rPr>
+          <w:rFonts w:cs="Calibri"/>
+        </w:rPr>
         <w:t>3. Rubrik Penilaian Teknis (Fokus pada Pemahaman)</w:t>
       </w:r>
     </w:p>
     <w:p>
       <w:r>
+        <w:rPr>
+          <w:rFonts w:cs="Cambria"/>
+        </w:rPr>
         <w:t>Sistem Penilaian:</w:t>
       </w:r>
     </w:p>
     <w:p>
       <w:r>
+        <w:rPr>
+          <w:rFonts w:cs="Cambria"/>
+        </w:rPr>
         <w:t>0 Poin = Tidak bisa menjelaskan / konsep tidak terlihat pada implementasi.</w:t>
       </w:r>
       <w:r>
         <w:br/>
+      </w:r>
+      <w:r>
+        <w:rPr>
+          <w:rFonts w:cs="Cambria"/>
+        </w:rPr>
         <w:t>1 Poin = Bisa menjelaskan secara garis besar, tapi implementasi buggy atau penjelasan dangkal.</w:t>
       </w:r>
       <w:r>
         <w:br/>
+      </w:r>
+      <w:r>
+        <w:rPr>
+          <w:rFonts w:cs="Cambria"/>
+        </w:rPr>
         <w:t>2 Poin = Penjelasan terstruktur, logis, dan 100% selaras dengan kode/implementasi game.</w:t>
       </w:r>
     </w:p>
@@ -700,21 +1495,39 @@
       <w:tblPr>
         <w:tblStyle w:val="TableGrid"/>
         <w:tblW w:w="0" w:type="auto"/>
-        <w:tblLook w:val="04A0" w:firstRow="1" w:lastRow="0" w:firstColumn="1" w:lastColumn="0" w:noHBand="0" w:noVBand="1"/>
+        <w:tblLook w:val="07E0" w:firstRow="1" w:lastRow="1" w:firstColumn="1" w:lastColumn="1" w:noHBand="1" w:noVBand="1"/>
       </w:tblPr>
       <w:tblGrid>
-        <w:gridCol w:w="2160"/>
-        <w:gridCol w:w="2160"/>
-        <w:gridCol w:w="2160"/>
-        <w:gridCol w:w="2160"/>
+        <w:gridCol w:w="2158"/>
+        <w:gridCol w:w="2158"/>
+        <w:gridCol w:w="2157"/>
+        <w:gridCol w:w="2157"/>
       </w:tblGrid>
       <w:tr>
         <w:tc>
           <w:tcPr>
             <w:tcW w:w="2160" w:type="dxa"/>
+            <w:tcBorders>
+              <w:top w:val="single" w:sz="4" w:space="0" w:color="auto"/>
+              <w:left w:val="single" w:sz="4" w:space="0" w:color="auto"/>
+              <w:bottom w:val="single" w:sz="4" w:space="0" w:color="auto"/>
+              <w:right w:val="single" w:sz="4" w:space="0" w:color="auto"/>
+            </w:tcBorders>
+            <w:tcMar>
+              <w:top w:w="0" w:type="dxa"/>
+              <w:left w:w="108" w:type="dxa"/>
+              <w:bottom w:w="0" w:type="dxa"/>
+              <w:right w:w="108" w:type="dxa"/>
+            </w:tcMar>
           </w:tcPr>
           <w:p>
+            <w:pPr>
+              <w:spacing w:after="200" w:line="276" w:lineRule="auto"/>
+            </w:pPr>
             <w:r>
+              <w:rPr>
+                <w:rFonts w:cs="Cambria"/>
+              </w:rPr>
               <w:t>Kriteria Penilaian Teknis</w:t>
             </w:r>
           </w:p>
@@ -722,9 +1535,27 @@
         <w:tc>
           <w:tcPr>
             <w:tcW w:w="2160" w:type="dxa"/>
+            <w:tcBorders>
+              <w:top w:val="single" w:sz="4" w:space="0" w:color="auto"/>
+              <w:left w:val="single" w:sz="4" w:space="0" w:color="auto"/>
+              <w:bottom w:val="single" w:sz="4" w:space="0" w:color="auto"/>
+              <w:right w:val="single" w:sz="4" w:space="0" w:color="auto"/>
+            </w:tcBorders>
+            <w:tcMar>
+              <w:top w:w="0" w:type="dxa"/>
+              <w:left w:w="108" w:type="dxa"/>
+              <w:bottom w:w="0" w:type="dxa"/>
+              <w:right w:w="108" w:type="dxa"/>
+            </w:tcMar>
           </w:tcPr>
           <w:p>
+            <w:pPr>
+              <w:spacing w:after="200" w:line="276" w:lineRule="auto"/>
+            </w:pPr>
             <w:r>
+              <w:rPr>
+                <w:rFonts w:cs="Cambria"/>
+              </w:rPr>
               <w:t>Indikator Pertanyaan untuk Kelompok</w:t>
             </w:r>
           </w:p>
@@ -732,9 +1563,27 @@
         <w:tc>
           <w:tcPr>
             <w:tcW w:w="2160" w:type="dxa"/>
+            <w:tcBorders>
+              <w:top w:val="single" w:sz="4" w:space="0" w:color="auto"/>
+              <w:left w:val="single" w:sz="4" w:space="0" w:color="auto"/>
+              <w:bottom w:val="single" w:sz="4" w:space="0" w:color="auto"/>
+              <w:right w:val="single" w:sz="4" w:space="0" w:color="auto"/>
+            </w:tcBorders>
+            <w:tcMar>
+              <w:top w:w="0" w:type="dxa"/>
+              <w:left w:w="108" w:type="dxa"/>
+              <w:bottom w:w="0" w:type="dxa"/>
+              <w:right w:w="108" w:type="dxa"/>
+            </w:tcMar>
           </w:tcPr>
           <w:p>
+            <w:pPr>
+              <w:spacing w:after="200" w:line="276" w:lineRule="auto"/>
+            </w:pPr>
             <w:r>
+              <w:rPr>
+                <w:rFonts w:cs="Cambria"/>
+              </w:rPr>
               <w:t>Poin (0/1/2)</w:t>
             </w:r>
           </w:p>
@@ -742,9 +1591,27 @@
         <w:tc>
           <w:tcPr>
             <w:tcW w:w="2160" w:type="dxa"/>
+            <w:tcBorders>
+              <w:top w:val="single" w:sz="4" w:space="0" w:color="auto"/>
+              <w:left w:val="single" w:sz="4" w:space="0" w:color="auto"/>
+              <w:bottom w:val="single" w:sz="4" w:space="0" w:color="auto"/>
+              <w:right w:val="single" w:sz="4" w:space="0" w:color="auto"/>
+            </w:tcBorders>
+            <w:tcMar>
+              <w:top w:w="0" w:type="dxa"/>
+              <w:left w:w="108" w:type="dxa"/>
+              <w:bottom w:w="0" w:type="dxa"/>
+              <w:right w:w="108" w:type="dxa"/>
+            </w:tcMar>
           </w:tcPr>
           <w:p>
+            <w:pPr>
+              <w:spacing w:after="200" w:line="276" w:lineRule="auto"/>
+            </w:pPr>
             <w:r>
+              <w:rPr>
+                <w:rFonts w:cs="Cambria"/>
+              </w:rPr>
               <w:t>Catatan Penilai</w:t>
             </w:r>
           </w:p>
@@ -754,9 +1621,27 @@
         <w:tc>
           <w:tcPr>
             <w:tcW w:w="2160" w:type="dxa"/>
+            <w:tcBorders>
+              <w:top w:val="single" w:sz="4" w:space="0" w:color="auto"/>
+              <w:left w:val="single" w:sz="4" w:space="0" w:color="auto"/>
+              <w:bottom w:val="single" w:sz="4" w:space="0" w:color="auto"/>
+              <w:right w:val="single" w:sz="4" w:space="0" w:color="auto"/>
+            </w:tcBorders>
+            <w:tcMar>
+              <w:top w:w="0" w:type="dxa"/>
+              <w:left w:w="108" w:type="dxa"/>
+              <w:bottom w:w="0" w:type="dxa"/>
+              <w:right w:w="108" w:type="dxa"/>
+            </w:tcMar>
           </w:tcPr>
           <w:p>
+            <w:pPr>
+              <w:spacing w:after="200" w:line="276" w:lineRule="auto"/>
+            </w:pPr>
             <w:r>
+              <w:rPr>
+                <w:rFonts w:cs="Cambria"/>
+              </w:rPr>
               <w:t>Pemahaman Main Game Loop</w:t>
             </w:r>
           </w:p>
@@ -764,9 +1649,27 @@
         <w:tc>
           <w:tcPr>
             <w:tcW w:w="2160" w:type="dxa"/>
+            <w:tcBorders>
+              <w:top w:val="single" w:sz="4" w:space="0" w:color="auto"/>
+              <w:left w:val="single" w:sz="4" w:space="0" w:color="auto"/>
+              <w:bottom w:val="single" w:sz="4" w:space="0" w:color="auto"/>
+              <w:right w:val="single" w:sz="4" w:space="0" w:color="auto"/>
+            </w:tcBorders>
+            <w:tcMar>
+              <w:top w:w="0" w:type="dxa"/>
+              <w:left w:w="108" w:type="dxa"/>
+              <w:bottom w:w="0" w:type="dxa"/>
+              <w:right w:w="108" w:type="dxa"/>
+            </w:tcMar>
           </w:tcPr>
           <w:p>
+            <w:pPr>
+              <w:spacing w:after="200" w:line="276" w:lineRule="auto"/>
+            </w:pPr>
             <w:r>
+              <w:rPr>
+                <w:rFonts w:cs="Cambria"/>
+              </w:rPr>
               <w:t>Coba jelaskan bagaimana game Anda memproses input, memperbarui logika (update), dan menggambar visual (render) setiap frame/turn?</w:t>
             </w:r>
           </w:p>
@@ -774,23 +1677,73 @@
         <w:tc>
           <w:tcPr>
             <w:tcW w:w="2160" w:type="dxa"/>
+            <w:tcBorders>
+              <w:top w:val="single" w:sz="4" w:space="0" w:color="auto"/>
+              <w:left w:val="single" w:sz="4" w:space="0" w:color="auto"/>
+              <w:bottom w:val="single" w:sz="4" w:space="0" w:color="auto"/>
+              <w:right w:val="single" w:sz="4" w:space="0" w:color="auto"/>
+            </w:tcBorders>
+            <w:tcMar>
+              <w:top w:w="0" w:type="dxa"/>
+              <w:left w:w="108" w:type="dxa"/>
+              <w:bottom w:w="0" w:type="dxa"/>
+              <w:right w:w="108" w:type="dxa"/>
+            </w:tcMar>
           </w:tcPr>
-          <w:p/>
+          <w:p>
+            <w:pPr>
+              <w:spacing w:after="200" w:line="276" w:lineRule="auto"/>
+            </w:pPr>
+          </w:p>
         </w:tc>
         <w:tc>
           <w:tcPr>
             <w:tcW w:w="2160" w:type="dxa"/>
+            <w:tcBorders>
+              <w:top w:val="single" w:sz="4" w:space="0" w:color="auto"/>
+              <w:left w:val="single" w:sz="4" w:space="0" w:color="auto"/>
+              <w:bottom w:val="single" w:sz="4" w:space="0" w:color="auto"/>
+              <w:right w:val="single" w:sz="4" w:space="0" w:color="auto"/>
+            </w:tcBorders>
+            <w:tcMar>
+              <w:top w:w="0" w:type="dxa"/>
+              <w:left w:w="108" w:type="dxa"/>
+              <w:bottom w:w="0" w:type="dxa"/>
+              <w:right w:w="108" w:type="dxa"/>
+            </w:tcMar>
           </w:tcPr>
-          <w:p/>
+          <w:p>
+            <w:pPr>
+              <w:spacing w:after="200" w:line="276" w:lineRule="auto"/>
+            </w:pPr>
+          </w:p>
         </w:tc>
       </w:tr>
       <w:tr>
         <w:tc>
           <w:tcPr>
             <w:tcW w:w="2160" w:type="dxa"/>
+            <w:tcBorders>
+              <w:top w:val="single" w:sz="4" w:space="0" w:color="auto"/>
+              <w:left w:val="single" w:sz="4" w:space="0" w:color="auto"/>
+              <w:bottom w:val="single" w:sz="4" w:space="0" w:color="auto"/>
+              <w:right w:val="single" w:sz="4" w:space="0" w:color="auto"/>
+            </w:tcBorders>
+            <w:tcMar>
+              <w:top w:w="0" w:type="dxa"/>
+              <w:left w:w="108" w:type="dxa"/>
+              <w:bottom w:w="0" w:type="dxa"/>
+              <w:right w:w="108" w:type="dxa"/>
+            </w:tcMar>
           </w:tcPr>
           <w:p>
+            <w:pPr>
+              <w:spacing w:after="200" w:line="276" w:lineRule="auto"/>
+            </w:pPr>
             <w:r>
+              <w:rPr>
+                <w:rFonts w:cs="Cambria"/>
+              </w:rPr>
               <w:t>Manajemen State</w:t>
             </w:r>
           </w:p>
@@ -798,9 +1751,27 @@
         <w:tc>
           <w:tcPr>
             <w:tcW w:w="2160" w:type="dxa"/>
+            <w:tcBorders>
+              <w:top w:val="single" w:sz="4" w:space="0" w:color="auto"/>
+              <w:left w:val="single" w:sz="4" w:space="0" w:color="auto"/>
+              <w:bottom w:val="single" w:sz="4" w:space="0" w:color="auto"/>
+              <w:right w:val="single" w:sz="4" w:space="0" w:color="auto"/>
+            </w:tcBorders>
+            <w:tcMar>
+              <w:top w:w="0" w:type="dxa"/>
+              <w:left w:w="108" w:type="dxa"/>
+              <w:bottom w:w="0" w:type="dxa"/>
+              <w:right w:w="108" w:type="dxa"/>
+            </w:tcMar>
           </w:tcPr>
           <w:p>
+            <w:pPr>
+              <w:spacing w:after="200" w:line="276" w:lineRule="auto"/>
+            </w:pPr>
             <w:r>
+              <w:rPr>
+                <w:rFonts w:cs="Cambria"/>
+              </w:rPr>
               <w:t>Bagaimana cara sistem membedakan saat pemain di Menu, Bermain, Pause, atau Game Over? Di mana variabel ini disimpan?</w:t>
             </w:r>
           </w:p>
@@ -808,23 +1779,73 @@
         <w:tc>
           <w:tcPr>
             <w:tcW w:w="2160" w:type="dxa"/>
+            <w:tcBorders>
+              <w:top w:val="single" w:sz="4" w:space="0" w:color="auto"/>
+              <w:left w:val="single" w:sz="4" w:space="0" w:color="auto"/>
+              <w:bottom w:val="single" w:sz="4" w:space="0" w:color="auto"/>
+              <w:right w:val="single" w:sz="4" w:space="0" w:color="auto"/>
+            </w:tcBorders>
+            <w:tcMar>
+              <w:top w:w="0" w:type="dxa"/>
+              <w:left w:w="108" w:type="dxa"/>
+              <w:bottom w:w="0" w:type="dxa"/>
+              <w:right w:w="108" w:type="dxa"/>
+            </w:tcMar>
           </w:tcPr>
-          <w:p/>
+          <w:p>
+            <w:pPr>
+              <w:spacing w:after="200" w:line="276" w:lineRule="auto"/>
+            </w:pPr>
+          </w:p>
         </w:tc>
         <w:tc>
           <w:tcPr>
             <w:tcW w:w="2160" w:type="dxa"/>
+            <w:tcBorders>
+              <w:top w:val="single" w:sz="4" w:space="0" w:color="auto"/>
+              <w:left w:val="single" w:sz="4" w:space="0" w:color="auto"/>
+              <w:bottom w:val="single" w:sz="4" w:space="0" w:color="auto"/>
+              <w:right w:val="single" w:sz="4" w:space="0" w:color="auto"/>
+            </w:tcBorders>
+            <w:tcMar>
+              <w:top w:w="0" w:type="dxa"/>
+              <w:left w:w="108" w:type="dxa"/>
+              <w:bottom w:w="0" w:type="dxa"/>
+              <w:right w:w="108" w:type="dxa"/>
+            </w:tcMar>
           </w:tcPr>
-          <w:p/>
+          <w:p>
+            <w:pPr>
+              <w:spacing w:after="200" w:line="276" w:lineRule="auto"/>
+            </w:pPr>
+          </w:p>
         </w:tc>
       </w:tr>
       <w:tr>
         <w:tc>
           <w:tcPr>
             <w:tcW w:w="2160" w:type="dxa"/>
+            <w:tcBorders>
+              <w:top w:val="single" w:sz="4" w:space="0" w:color="auto"/>
+              <w:left w:val="single" w:sz="4" w:space="0" w:color="auto"/>
+              <w:bottom w:val="single" w:sz="4" w:space="0" w:color="auto"/>
+              <w:right w:val="single" w:sz="4" w:space="0" w:color="auto"/>
+            </w:tcBorders>
+            <w:tcMar>
+              <w:top w:w="0" w:type="dxa"/>
+              <w:left w:w="108" w:type="dxa"/>
+              <w:bottom w:w="0" w:type="dxa"/>
+              <w:right w:w="108" w:type="dxa"/>
+            </w:tcMar>
           </w:tcPr>
           <w:p>
+            <w:pPr>
+              <w:spacing w:after="200" w:line="276" w:lineRule="auto"/>
+            </w:pPr>
             <w:r>
+              <w:rPr>
+                <w:rFonts w:cs="Cambria"/>
+              </w:rPr>
               <w:t>Struktur Objek (OOP/ECS)</w:t>
             </w:r>
           </w:p>
@@ -832,9 +1853,27 @@
         <w:tc>
           <w:tcPr>
             <w:tcW w:w="2160" w:type="dxa"/>
+            <w:tcBorders>
+              <w:top w:val="single" w:sz="4" w:space="0" w:color="auto"/>
+              <w:left w:val="single" w:sz="4" w:space="0" w:color="auto"/>
+              <w:bottom w:val="single" w:sz="4" w:space="0" w:color="auto"/>
+              <w:right w:val="single" w:sz="4" w:space="0" w:color="auto"/>
+            </w:tcBorders>
+            <w:tcMar>
+              <w:top w:w="0" w:type="dxa"/>
+              <w:left w:w="108" w:type="dxa"/>
+              <w:bottom w:w="0" w:type="dxa"/>
+              <w:right w:w="108" w:type="dxa"/>
+            </w:tcMar>
           </w:tcPr>
           <w:p>
+            <w:pPr>
+              <w:spacing w:after="200" w:line="276" w:lineRule="auto"/>
+            </w:pPr>
             <w:r>
+              <w:rPr>
+                <w:rFonts w:cs="Cambria"/>
+              </w:rPr>
               <w:t>Jelaskan struktur kelas dari entitas utama di game. Komponen apa saja yang menyusun entitas tersebut dan mengapa didesain demikian?</w:t>
             </w:r>
           </w:p>
@@ -842,23 +1881,73 @@
         <w:tc>
           <w:tcPr>
             <w:tcW w:w="2160" w:type="dxa"/>
+            <w:tcBorders>
+              <w:top w:val="single" w:sz="4" w:space="0" w:color="auto"/>
+              <w:left w:val="single" w:sz="4" w:space="0" w:color="auto"/>
+              <w:bottom w:val="single" w:sz="4" w:space="0" w:color="auto"/>
+              <w:right w:val="single" w:sz="4" w:space="0" w:color="auto"/>
+            </w:tcBorders>
+            <w:tcMar>
+              <w:top w:w="0" w:type="dxa"/>
+              <w:left w:w="108" w:type="dxa"/>
+              <w:bottom w:w="0" w:type="dxa"/>
+              <w:right w:w="108" w:type="dxa"/>
+            </w:tcMar>
           </w:tcPr>
-          <w:p/>
+          <w:p>
+            <w:pPr>
+              <w:spacing w:after="200" w:line="276" w:lineRule="auto"/>
+            </w:pPr>
+          </w:p>
         </w:tc>
         <w:tc>
           <w:tcPr>
             <w:tcW w:w="2160" w:type="dxa"/>
+            <w:tcBorders>
+              <w:top w:val="single" w:sz="4" w:space="0" w:color="auto"/>
+              <w:left w:val="single" w:sz="4" w:space="0" w:color="auto"/>
+              <w:bottom w:val="single" w:sz="4" w:space="0" w:color="auto"/>
+              <w:right w:val="single" w:sz="4" w:space="0" w:color="auto"/>
+            </w:tcBorders>
+            <w:tcMar>
+              <w:top w:w="0" w:type="dxa"/>
+              <w:left w:w="108" w:type="dxa"/>
+              <w:bottom w:w="0" w:type="dxa"/>
+              <w:right w:w="108" w:type="dxa"/>
+            </w:tcMar>
           </w:tcPr>
-          <w:p/>
+          <w:p>
+            <w:pPr>
+              <w:spacing w:after="200" w:line="276" w:lineRule="auto"/>
+            </w:pPr>
+          </w:p>
         </w:tc>
       </w:tr>
       <w:tr>
         <w:tc>
           <w:tcPr>
             <w:tcW w:w="2160" w:type="dxa"/>
+            <w:tcBorders>
+              <w:top w:val="single" w:sz="4" w:space="0" w:color="auto"/>
+              <w:left w:val="single" w:sz="4" w:space="0" w:color="auto"/>
+              <w:bottom w:val="single" w:sz="4" w:space="0" w:color="auto"/>
+              <w:right w:val="single" w:sz="4" w:space="0" w:color="auto"/>
+            </w:tcBorders>
+            <w:tcMar>
+              <w:top w:w="0" w:type="dxa"/>
+              <w:left w:w="108" w:type="dxa"/>
+              <w:bottom w:w="0" w:type="dxa"/>
+              <w:right w:w="108" w:type="dxa"/>
+            </w:tcMar>
           </w:tcPr>
           <w:p>
+            <w:pPr>
+              <w:spacing w:after="200" w:line="276" w:lineRule="auto"/>
+            </w:pPr>
             <w:r>
+              <w:rPr>
+                <w:rFonts w:cs="Cambria"/>
+              </w:rPr>
               <w:t>Logika Interaksi &amp; Menang/Kalah</w:t>
             </w:r>
           </w:p>
@@ -866,41 +1955,150 @@
         <w:tc>
           <w:tcPr>
             <w:tcW w:w="2160" w:type="dxa"/>
+            <w:tcBorders>
+              <w:top w:val="single" w:sz="4" w:space="0" w:color="auto"/>
+              <w:left w:val="single" w:sz="4" w:space="0" w:color="auto"/>
+              <w:bottom w:val="single" w:sz="4" w:space="0" w:color="auto"/>
+              <w:right w:val="single" w:sz="4" w:space="0" w:color="auto"/>
+            </w:tcBorders>
+            <w:tcMar>
+              <w:top w:w="0" w:type="dxa"/>
+              <w:left w:w="108" w:type="dxa"/>
+              <w:bottom w:w="0" w:type="dxa"/>
+              <w:right w:w="108" w:type="dxa"/>
+            </w:tcMar>
           </w:tcPr>
           <w:p>
+            <w:pPr>
+              <w:spacing w:after="200" w:line="276" w:lineRule="auto"/>
+            </w:pPr>
             <w:r>
-              <w:t>Tunjukkan blok kode yang mengatur syarat selesainya game. Bagaimana sistem mendeteksi bahwa syarat menang/kalah terpenuhi?</w:t>
+              <w:rPr>
+                <w:rFonts w:cs="Cambria"/>
+              </w:rPr>
+              <w:t xml:space="preserve">Tunjukkan blok kode yang mengatur syarat selesainya </w:t>
+            </w:r>
+            <w:r>
+              <w:rPr>
+                <w:rFonts w:cs="Cambria"/>
+              </w:rPr>
+              <w:lastRenderedPageBreak/>
+              <w:t>game. Bagaimana sistem mendeteksi bahwa syarat menang/kalah terpenuhi?</w:t>
             </w:r>
           </w:p>
         </w:tc>
         <w:tc>
           <w:tcPr>
             <w:tcW w:w="2160" w:type="dxa"/>
+            <w:tcBorders>
+              <w:top w:val="single" w:sz="4" w:space="0" w:color="auto"/>
+              <w:left w:val="single" w:sz="4" w:space="0" w:color="auto"/>
+              <w:bottom w:val="single" w:sz="4" w:space="0" w:color="auto"/>
+              <w:right w:val="single" w:sz="4" w:space="0" w:color="auto"/>
+            </w:tcBorders>
+            <w:tcMar>
+              <w:top w:w="0" w:type="dxa"/>
+              <w:left w:w="108" w:type="dxa"/>
+              <w:bottom w:w="0" w:type="dxa"/>
+              <w:right w:w="108" w:type="dxa"/>
+            </w:tcMar>
           </w:tcPr>
-          <w:p/>
+          <w:p>
+            <w:pPr>
+              <w:spacing w:after="200" w:line="276" w:lineRule="auto"/>
+            </w:pPr>
+          </w:p>
         </w:tc>
         <w:tc>
           <w:tcPr>
             <w:tcW w:w="2160" w:type="dxa"/>
+            <w:tcBorders>
+              <w:top w:val="single" w:sz="4" w:space="0" w:color="auto"/>
+              <w:left w:val="single" w:sz="4" w:space="0" w:color="auto"/>
+              <w:bottom w:val="single" w:sz="4" w:space="0" w:color="auto"/>
+              <w:right w:val="single" w:sz="4" w:space="0" w:color="auto"/>
+            </w:tcBorders>
+            <w:tcMar>
+              <w:top w:w="0" w:type="dxa"/>
+              <w:left w:w="108" w:type="dxa"/>
+              <w:bottom w:w="0" w:type="dxa"/>
+              <w:right w:w="108" w:type="dxa"/>
+            </w:tcMar>
           </w:tcPr>
-          <w:p/>
+          <w:p>
+            <w:pPr>
+              <w:spacing w:after="200" w:line="276" w:lineRule="auto"/>
+            </w:pPr>
+          </w:p>
         </w:tc>
       </w:tr>
       <w:tr>
         <w:tc>
           <w:tcPr>
             <w:tcW w:w="2160" w:type="dxa"/>
+            <w:tcBorders>
+              <w:top w:val="single" w:sz="4" w:space="0" w:color="auto"/>
+              <w:left w:val="single" w:sz="4" w:space="0" w:color="auto"/>
+              <w:bottom w:val="single" w:sz="4" w:space="0" w:color="auto"/>
+              <w:right w:val="single" w:sz="4" w:space="0" w:color="auto"/>
+            </w:tcBorders>
+            <w:tcMar>
+              <w:top w:w="0" w:type="dxa"/>
+              <w:left w:w="108" w:type="dxa"/>
+              <w:bottom w:w="0" w:type="dxa"/>
+              <w:right w:w="108" w:type="dxa"/>
+            </w:tcMar>
           </w:tcPr>
           <w:p>
+            <w:pPr>
+              <w:spacing w:after="200" w:line="276" w:lineRule="auto"/>
+            </w:pPr>
             <w:r>
-              <w:t xml:space="preserve">Tingkat </w:t>
+              <w:rPr>
+                <w:rFonts w:cs="Cambria"/>
+              </w:rPr>
+              <w:t>Tingkat kerumitan game</w:t>
             </w:r>
-            <w:proofErr w:type="spellStart"/>
+          </w:p>
+        </w:tc>
+        <w:tc>
+          <w:tcPr>
+            <w:tcW w:w="2160" w:type="dxa"/>
+            <w:tcBorders>
+              <w:top w:val="single" w:sz="4" w:space="0" w:color="auto"/>
+              <w:left w:val="single" w:sz="4" w:space="0" w:color="auto"/>
+              <w:bottom w:val="single" w:sz="4" w:space="0" w:color="auto"/>
+              <w:right w:val="single" w:sz="4" w:space="0" w:color="auto"/>
+            </w:tcBorders>
+            <w:tcMar>
+              <w:top w:w="0" w:type="dxa"/>
+              <w:left w:w="108" w:type="dxa"/>
+              <w:bottom w:w="0" w:type="dxa"/>
+              <w:right w:w="108" w:type="dxa"/>
+            </w:tcMar>
+          </w:tcPr>
+          <w:p>
+            <w:pPr>
+              <w:spacing w:after="200" w:line="276" w:lineRule="auto"/>
+            </w:pPr>
             <w:r>
-              <w:t>kerumitan</w:t>
+              <w:rPr>
+                <w:rFonts w:cs="Cambria"/>
+              </w:rPr>
+              <w:t xml:space="preserve">Seberapa banyak syarat atau aturan kendali, collider, syarat </w:t>
             </w:r>
-            <w:proofErr w:type="spellEnd"/>
+            <w:proofErr w:type="gramStart"/>
             <w:r>
+              <w:rPr>
+                <w:rFonts w:cs="Cambria"/>
+              </w:rPr>
+              <w:t>penyelesaian  dalam</w:t>
+            </w:r>
+            <w:proofErr w:type="gramEnd"/>
+            <w:r>
+              <w:rPr>
+                <w:rFonts w:cs="Cambria"/>
+              </w:rPr>
               <w:t xml:space="preserve"> game</w:t>
             </w:r>
           </w:p>
@@ -908,93 +2106,46 @@
         <w:tc>
           <w:tcPr>
             <w:tcW w:w="2160" w:type="dxa"/>
+            <w:tcBorders>
+              <w:top w:val="single" w:sz="4" w:space="0" w:color="auto"/>
+              <w:left w:val="single" w:sz="4" w:space="0" w:color="auto"/>
+              <w:bottom w:val="single" w:sz="4" w:space="0" w:color="auto"/>
+              <w:right w:val="single" w:sz="4" w:space="0" w:color="auto"/>
+            </w:tcBorders>
+            <w:tcMar>
+              <w:top w:w="0" w:type="dxa"/>
+              <w:left w:w="108" w:type="dxa"/>
+              <w:bottom w:w="0" w:type="dxa"/>
+              <w:right w:w="108" w:type="dxa"/>
+            </w:tcMar>
           </w:tcPr>
           <w:p>
-            <w:proofErr w:type="spellStart"/>
-            <w:r>
-              <w:t>Seberapa</w:t>
-            </w:r>
-            <w:proofErr w:type="spellEnd"/>
-            <w:r>
-              <w:t xml:space="preserve"> </w:t>
-            </w:r>
-            <w:proofErr w:type="spellStart"/>
-            <w:r>
-              <w:t>banyak</w:t>
-            </w:r>
-            <w:proofErr w:type="spellEnd"/>
-            <w:r>
-              <w:t xml:space="preserve"> </w:t>
-            </w:r>
-            <w:proofErr w:type="spellStart"/>
-            <w:r>
-              <w:t>syarat</w:t>
-            </w:r>
-            <w:proofErr w:type="spellEnd"/>
-            <w:r>
-              <w:t xml:space="preserve"> </w:t>
-            </w:r>
-            <w:proofErr w:type="spellStart"/>
-            <w:r>
-              <w:t>atau</w:t>
-            </w:r>
-            <w:proofErr w:type="spellEnd"/>
-            <w:r>
-              <w:t xml:space="preserve"> </w:t>
-            </w:r>
-            <w:proofErr w:type="spellStart"/>
-            <w:r>
-              <w:t>aturan</w:t>
-            </w:r>
-            <w:proofErr w:type="spellEnd"/>
-            <w:r>
-              <w:t xml:space="preserve"> </w:t>
-            </w:r>
-            <w:proofErr w:type="spellStart"/>
-            <w:r>
-              <w:t>kendali</w:t>
-            </w:r>
-            <w:proofErr w:type="spellEnd"/>
-            <w:r>
-              <w:t xml:space="preserve">, collider, </w:t>
-            </w:r>
-            <w:proofErr w:type="spellStart"/>
-            <w:r>
-              <w:t>syarat</w:t>
-            </w:r>
-            <w:proofErr w:type="spellEnd"/>
-            <w:r>
-              <w:t xml:space="preserve"> </w:t>
-            </w:r>
-            <w:proofErr w:type="spellStart"/>
-            <w:r>
-              <w:t>penyelesaian</w:t>
-            </w:r>
-            <w:proofErr w:type="spellEnd"/>
-            <w:r>
-              <w:t xml:space="preserve">  </w:t>
-            </w:r>
-            <w:proofErr w:type="spellStart"/>
-            <w:r>
-              <w:t>dalam</w:t>
-            </w:r>
-            <w:proofErr w:type="spellEnd"/>
-            <w:r>
-              <w:t xml:space="preserve"> game</w:t>
-            </w:r>
+            <w:pPr>
+              <w:spacing w:after="200" w:line="276" w:lineRule="auto"/>
+            </w:pPr>
           </w:p>
         </w:tc>
         <w:tc>
           <w:tcPr>
             <w:tcW w:w="2160" w:type="dxa"/>
+            <w:tcBorders>
+              <w:top w:val="single" w:sz="4" w:space="0" w:color="auto"/>
+              <w:left w:val="single" w:sz="4" w:space="0" w:color="auto"/>
+              <w:bottom w:val="single" w:sz="4" w:space="0" w:color="auto"/>
+              <w:right w:val="single" w:sz="4" w:space="0" w:color="auto"/>
+            </w:tcBorders>
+            <w:tcMar>
+              <w:top w:w="0" w:type="dxa"/>
+              <w:left w:w="108" w:type="dxa"/>
+              <w:bottom w:w="0" w:type="dxa"/>
+              <w:right w:w="108" w:type="dxa"/>
+            </w:tcMar>
           </w:tcPr>
-          <w:p/>
-        </w:tc>
-        <w:tc>
-          <w:tcPr>
-            <w:tcW w:w="2160" w:type="dxa"/>
-          </w:tcPr>
-          <w:p/>
+          <w:p>
+            <w:pPr>
+              <w:spacing w:after="200" w:line="276" w:lineRule="auto"/>
+            </w:pPr>
+          </w:p>
         </w:tc>
       </w:tr>
     </w:tbl>
@@ -1004,12 +2155,17 @@
         <w:pStyle w:val="Heading1"/>
       </w:pPr>
       <w:r>
-        <w:lastRenderedPageBreak/>
+        <w:rPr>
+          <w:rFonts w:cs="Calibri"/>
+        </w:rPr>
         <w:t>4. Rubrik Penilaian UX (Universal Player Experience)</w:t>
       </w:r>
     </w:p>
     <w:p>
       <w:r>
+        <w:rPr>
+          <w:rFonts w:cs="Cambria"/>
+        </w:rPr>
         <w:t>Sistem Penilaian: Ceklis observasi (Ya = 10 Poin, Tidak = 0). Sangat cocok untuk peer-review di mana penilai bertindak sebagai pemain awam.</w:t>
       </w:r>
     </w:p>
@@ -1017,20 +2173,38 @@
       <w:tblPr>
         <w:tblStyle w:val="TableGrid"/>
         <w:tblW w:w="0" w:type="auto"/>
-        <w:tblLook w:val="04A0" w:firstRow="1" w:lastRow="0" w:firstColumn="1" w:lastColumn="0" w:noHBand="0" w:noVBand="1"/>
+        <w:tblLook w:val="07E0" w:firstRow="1" w:lastRow="1" w:firstColumn="1" w:lastColumn="1" w:noHBand="1" w:noVBand="1"/>
       </w:tblPr>
       <w:tblGrid>
-        <w:gridCol w:w="2880"/>
-        <w:gridCol w:w="2880"/>
-        <w:gridCol w:w="2880"/>
+        <w:gridCol w:w="2877"/>
+        <w:gridCol w:w="2877"/>
+        <w:gridCol w:w="2876"/>
       </w:tblGrid>
       <w:tr>
         <w:tc>
           <w:tcPr>
             <w:tcW w:w="2880" w:type="dxa"/>
+            <w:tcBorders>
+              <w:top w:val="single" w:sz="4" w:space="0" w:color="auto"/>
+              <w:left w:val="single" w:sz="4" w:space="0" w:color="auto"/>
+              <w:bottom w:val="single" w:sz="4" w:space="0" w:color="auto"/>
+              <w:right w:val="single" w:sz="4" w:space="0" w:color="auto"/>
+            </w:tcBorders>
+            <w:tcMar>
+              <w:top w:w="0" w:type="dxa"/>
+              <w:left w:w="108" w:type="dxa"/>
+              <w:bottom w:w="0" w:type="dxa"/>
+              <w:right w:w="108" w:type="dxa"/>
+            </w:tcMar>
           </w:tcPr>
           <w:p>
+            <w:pPr>
+              <w:spacing w:after="200" w:line="276" w:lineRule="auto"/>
+            </w:pPr>
             <w:r>
+              <w:rPr>
+                <w:rFonts w:cs="Cambria"/>
+              </w:rPr>
               <w:t>Kriteria UX</w:t>
             </w:r>
           </w:p>
@@ -1038,9 +2212,27 @@
         <w:tc>
           <w:tcPr>
             <w:tcW w:w="2880" w:type="dxa"/>
+            <w:tcBorders>
+              <w:top w:val="single" w:sz="4" w:space="0" w:color="auto"/>
+              <w:left w:val="single" w:sz="4" w:space="0" w:color="auto"/>
+              <w:bottom w:val="single" w:sz="4" w:space="0" w:color="auto"/>
+              <w:right w:val="single" w:sz="4" w:space="0" w:color="auto"/>
+            </w:tcBorders>
+            <w:tcMar>
+              <w:top w:w="0" w:type="dxa"/>
+              <w:left w:w="108" w:type="dxa"/>
+              <w:bottom w:w="0" w:type="dxa"/>
+              <w:right w:w="108" w:type="dxa"/>
+            </w:tcMar>
           </w:tcPr>
           <w:p>
+            <w:pPr>
+              <w:spacing w:after="200" w:line="276" w:lineRule="auto"/>
+            </w:pPr>
             <w:r>
+              <w:rPr>
+                <w:rFonts w:cs="Cambria"/>
+              </w:rPr>
               <w:t>Ceklis Observasi</w:t>
             </w:r>
           </w:p>
@@ -1048,9 +2240,27 @@
         <w:tc>
           <w:tcPr>
             <w:tcW w:w="2880" w:type="dxa"/>
+            <w:tcBorders>
+              <w:top w:val="single" w:sz="4" w:space="0" w:color="auto"/>
+              <w:left w:val="single" w:sz="4" w:space="0" w:color="auto"/>
+              <w:bottom w:val="single" w:sz="4" w:space="0" w:color="auto"/>
+              <w:right w:val="single" w:sz="4" w:space="0" w:color="auto"/>
+            </w:tcBorders>
+            <w:tcMar>
+              <w:top w:w="0" w:type="dxa"/>
+              <w:left w:w="108" w:type="dxa"/>
+              <w:bottom w:w="0" w:type="dxa"/>
+              <w:right w:w="108" w:type="dxa"/>
+            </w:tcMar>
           </w:tcPr>
           <w:p>
+            <w:pPr>
+              <w:spacing w:after="200" w:line="276" w:lineRule="auto"/>
+            </w:pPr>
             <w:r>
+              <w:rPr>
+                <w:rFonts w:cs="Cambria"/>
+              </w:rPr>
               <w:t>Ya / Tidak</w:t>
             </w:r>
           </w:p>
@@ -1060,9 +2270,27 @@
         <w:tc>
           <w:tcPr>
             <w:tcW w:w="2880" w:type="dxa"/>
+            <w:tcBorders>
+              <w:top w:val="single" w:sz="4" w:space="0" w:color="auto"/>
+              <w:left w:val="single" w:sz="4" w:space="0" w:color="auto"/>
+              <w:bottom w:val="single" w:sz="4" w:space="0" w:color="auto"/>
+              <w:right w:val="single" w:sz="4" w:space="0" w:color="auto"/>
+            </w:tcBorders>
+            <w:tcMar>
+              <w:top w:w="0" w:type="dxa"/>
+              <w:left w:w="108" w:type="dxa"/>
+              <w:bottom w:w="0" w:type="dxa"/>
+              <w:right w:w="108" w:type="dxa"/>
+            </w:tcMar>
           </w:tcPr>
           <w:p>
+            <w:pPr>
+              <w:spacing w:after="200" w:line="276" w:lineRule="auto"/>
+            </w:pPr>
             <w:r>
+              <w:rPr>
+                <w:rFonts w:cs="Cambria"/>
+              </w:rPr>
               <w:t>Kejelasan Tujuan (Objective Clarity)</w:t>
             </w:r>
           </w:p>
@@ -1070,9 +2298,27 @@
         <w:tc>
           <w:tcPr>
             <w:tcW w:w="2880" w:type="dxa"/>
+            <w:tcBorders>
+              <w:top w:val="single" w:sz="4" w:space="0" w:color="auto"/>
+              <w:left w:val="single" w:sz="4" w:space="0" w:color="auto"/>
+              <w:bottom w:val="single" w:sz="4" w:space="0" w:color="auto"/>
+              <w:right w:val="single" w:sz="4" w:space="0" w:color="auto"/>
+            </w:tcBorders>
+            <w:tcMar>
+              <w:top w:w="0" w:type="dxa"/>
+              <w:left w:w="108" w:type="dxa"/>
+              <w:bottom w:w="0" w:type="dxa"/>
+              <w:right w:w="108" w:type="dxa"/>
+            </w:tcMar>
           </w:tcPr>
           <w:p>
+            <w:pPr>
+              <w:spacing w:after="200" w:line="276" w:lineRule="auto"/>
+            </w:pPr>
             <w:r>
+              <w:rPr>
+                <w:rFonts w:cs="Cambria"/>
+              </w:rPr>
               <w:t>Apakah dalam 1 menit pertama bermain, pemain langsung tahu apa tujuan utama yang harus dicapai dalam game ini?</w:t>
             </w:r>
           </w:p>
@@ -1080,9 +2326,27 @@
         <w:tc>
           <w:tcPr>
             <w:tcW w:w="2880" w:type="dxa"/>
+            <w:tcBorders>
+              <w:top w:val="single" w:sz="4" w:space="0" w:color="auto"/>
+              <w:left w:val="single" w:sz="4" w:space="0" w:color="auto"/>
+              <w:bottom w:val="single" w:sz="4" w:space="0" w:color="auto"/>
+              <w:right w:val="single" w:sz="4" w:space="0" w:color="auto"/>
+            </w:tcBorders>
+            <w:tcMar>
+              <w:top w:w="0" w:type="dxa"/>
+              <w:left w:w="108" w:type="dxa"/>
+              <w:bottom w:w="0" w:type="dxa"/>
+              <w:right w:w="108" w:type="dxa"/>
+            </w:tcMar>
           </w:tcPr>
           <w:p>
+            <w:pPr>
+              <w:spacing w:after="200" w:line="276" w:lineRule="auto"/>
+            </w:pPr>
             <w:r>
+              <w:rPr>
+                <w:rFonts w:cs="Cambria"/>
+              </w:rPr>
               <w:t>[  ]</w:t>
             </w:r>
           </w:p>
@@ -1092,9 +2356,27 @@
         <w:tc>
           <w:tcPr>
             <w:tcW w:w="2880" w:type="dxa"/>
+            <w:tcBorders>
+              <w:top w:val="single" w:sz="4" w:space="0" w:color="auto"/>
+              <w:left w:val="single" w:sz="4" w:space="0" w:color="auto"/>
+              <w:bottom w:val="single" w:sz="4" w:space="0" w:color="auto"/>
+              <w:right w:val="single" w:sz="4" w:space="0" w:color="auto"/>
+            </w:tcBorders>
+            <w:tcMar>
+              <w:top w:w="0" w:type="dxa"/>
+              <w:left w:w="108" w:type="dxa"/>
+              <w:bottom w:w="0" w:type="dxa"/>
+              <w:right w:w="108" w:type="dxa"/>
+            </w:tcMar>
           </w:tcPr>
           <w:p>
+            <w:pPr>
+              <w:spacing w:after="200" w:line="276" w:lineRule="auto"/>
+            </w:pPr>
             <w:r>
+              <w:rPr>
+                <w:rFonts w:cs="Cambria"/>
+              </w:rPr>
               <w:t>Umpan Balik (Feedback)</w:t>
             </w:r>
           </w:p>
@@ -1102,9 +2384,27 @@
         <w:tc>
           <w:tcPr>
             <w:tcW w:w="2880" w:type="dxa"/>
+            <w:tcBorders>
+              <w:top w:val="single" w:sz="4" w:space="0" w:color="auto"/>
+              <w:left w:val="single" w:sz="4" w:space="0" w:color="auto"/>
+              <w:bottom w:val="single" w:sz="4" w:space="0" w:color="auto"/>
+              <w:right w:val="single" w:sz="4" w:space="0" w:color="auto"/>
+            </w:tcBorders>
+            <w:tcMar>
+              <w:top w:w="0" w:type="dxa"/>
+              <w:left w:w="108" w:type="dxa"/>
+              <w:bottom w:w="0" w:type="dxa"/>
+              <w:right w:w="108" w:type="dxa"/>
+            </w:tcMar>
           </w:tcPr>
           <w:p>
+            <w:pPr>
+              <w:spacing w:after="200" w:line="276" w:lineRule="auto"/>
+            </w:pPr>
             <w:r>
+              <w:rPr>
+                <w:rFonts w:cs="Cambria"/>
+              </w:rPr>
               <w:t>Apakah game memberikan respons visual atau audio setiap kali pemain melakukan aksi penting (menekan tombol, skor, terkena damage)?</w:t>
             </w:r>
           </w:p>
@@ -1112,9 +2412,27 @@
         <w:tc>
           <w:tcPr>
             <w:tcW w:w="2880" w:type="dxa"/>
+            <w:tcBorders>
+              <w:top w:val="single" w:sz="4" w:space="0" w:color="auto"/>
+              <w:left w:val="single" w:sz="4" w:space="0" w:color="auto"/>
+              <w:bottom w:val="single" w:sz="4" w:space="0" w:color="auto"/>
+              <w:right w:val="single" w:sz="4" w:space="0" w:color="auto"/>
+            </w:tcBorders>
+            <w:tcMar>
+              <w:top w:w="0" w:type="dxa"/>
+              <w:left w:w="108" w:type="dxa"/>
+              <w:bottom w:w="0" w:type="dxa"/>
+              <w:right w:w="108" w:type="dxa"/>
+            </w:tcMar>
           </w:tcPr>
           <w:p>
+            <w:pPr>
+              <w:spacing w:after="200" w:line="276" w:lineRule="auto"/>
+            </w:pPr>
             <w:r>
+              <w:rPr>
+                <w:rFonts w:cs="Cambria"/>
+              </w:rPr>
               <w:t>[  ]</w:t>
             </w:r>
           </w:p>
@@ -1124,9 +2442,27 @@
         <w:tc>
           <w:tcPr>
             <w:tcW w:w="2880" w:type="dxa"/>
+            <w:tcBorders>
+              <w:top w:val="single" w:sz="4" w:space="0" w:color="auto"/>
+              <w:left w:val="single" w:sz="4" w:space="0" w:color="auto"/>
+              <w:bottom w:val="single" w:sz="4" w:space="0" w:color="auto"/>
+              <w:right w:val="single" w:sz="4" w:space="0" w:color="auto"/>
+            </w:tcBorders>
+            <w:tcMar>
+              <w:top w:w="0" w:type="dxa"/>
+              <w:left w:w="108" w:type="dxa"/>
+              <w:bottom w:w="0" w:type="dxa"/>
+              <w:right w:w="108" w:type="dxa"/>
+            </w:tcMar>
           </w:tcPr>
           <w:p>
+            <w:pPr>
+              <w:spacing w:after="200" w:line="276" w:lineRule="auto"/>
+            </w:pPr>
             <w:r>
+              <w:rPr>
+                <w:rFonts w:cs="Cambria"/>
+              </w:rPr>
               <w:t>Keterbacaan Visual (Readability)</w:t>
             </w:r>
           </w:p>
@@ -1134,9 +2470,27 @@
         <w:tc>
           <w:tcPr>
             <w:tcW w:w="2880" w:type="dxa"/>
+            <w:tcBorders>
+              <w:top w:val="single" w:sz="4" w:space="0" w:color="auto"/>
+              <w:left w:val="single" w:sz="4" w:space="0" w:color="auto"/>
+              <w:bottom w:val="single" w:sz="4" w:space="0" w:color="auto"/>
+              <w:right w:val="single" w:sz="4" w:space="0" w:color="auto"/>
+            </w:tcBorders>
+            <w:tcMar>
+              <w:top w:w="0" w:type="dxa"/>
+              <w:left w:w="108" w:type="dxa"/>
+              <w:bottom w:w="0" w:type="dxa"/>
+              <w:right w:w="108" w:type="dxa"/>
+            </w:tcMar>
           </w:tcPr>
           <w:p>
+            <w:pPr>
+              <w:spacing w:after="200" w:line="276" w:lineRule="auto"/>
+            </w:pPr>
             <w:r>
+              <w:rPr>
+                <w:rFonts w:cs="Cambria"/>
+              </w:rPr>
               <w:t>Apakah pemain bisa dengan mudah membedakan mana elemen interaktif (musuh/item) dan mana sekadar latar belakang (background)?</w:t>
             </w:r>
           </w:p>
@@ -1144,9 +2498,27 @@
         <w:tc>
           <w:tcPr>
             <w:tcW w:w="2880" w:type="dxa"/>
+            <w:tcBorders>
+              <w:top w:val="single" w:sz="4" w:space="0" w:color="auto"/>
+              <w:left w:val="single" w:sz="4" w:space="0" w:color="auto"/>
+              <w:bottom w:val="single" w:sz="4" w:space="0" w:color="auto"/>
+              <w:right w:val="single" w:sz="4" w:space="0" w:color="auto"/>
+            </w:tcBorders>
+            <w:tcMar>
+              <w:top w:w="0" w:type="dxa"/>
+              <w:left w:w="108" w:type="dxa"/>
+              <w:bottom w:w="0" w:type="dxa"/>
+              <w:right w:w="108" w:type="dxa"/>
+            </w:tcMar>
           </w:tcPr>
           <w:p>
+            <w:pPr>
+              <w:spacing w:after="200" w:line="276" w:lineRule="auto"/>
+            </w:pPr>
             <w:r>
+              <w:rPr>
+                <w:rFonts w:cs="Cambria"/>
+              </w:rPr>
               <w:t>[  ]</w:t>
             </w:r>
           </w:p>
@@ -1156,9 +2528,27 @@
         <w:tc>
           <w:tcPr>
             <w:tcW w:w="2880" w:type="dxa"/>
+            <w:tcBorders>
+              <w:top w:val="single" w:sz="4" w:space="0" w:color="auto"/>
+              <w:left w:val="single" w:sz="4" w:space="0" w:color="auto"/>
+              <w:bottom w:val="single" w:sz="4" w:space="0" w:color="auto"/>
+              <w:right w:val="single" w:sz="4" w:space="0" w:color="auto"/>
+            </w:tcBorders>
+            <w:tcMar>
+              <w:top w:w="0" w:type="dxa"/>
+              <w:left w:w="108" w:type="dxa"/>
+              <w:bottom w:w="0" w:type="dxa"/>
+              <w:right w:w="108" w:type="dxa"/>
+            </w:tcMar>
           </w:tcPr>
           <w:p>
+            <w:pPr>
+              <w:spacing w:after="200" w:line="276" w:lineRule="auto"/>
+            </w:pPr>
             <w:r>
+              <w:rPr>
+                <w:rFonts w:cs="Cambria"/>
+              </w:rPr>
               <w:t>Intuitivitas Kontrol (Mapping)</w:t>
             </w:r>
           </w:p>
@@ -1166,19 +2556,63 @@
         <w:tc>
           <w:tcPr>
             <w:tcW w:w="2880" w:type="dxa"/>
+            <w:tcBorders>
+              <w:top w:val="single" w:sz="4" w:space="0" w:color="auto"/>
+              <w:left w:val="single" w:sz="4" w:space="0" w:color="auto"/>
+              <w:bottom w:val="single" w:sz="4" w:space="0" w:color="auto"/>
+              <w:right w:val="single" w:sz="4" w:space="0" w:color="auto"/>
+            </w:tcBorders>
+            <w:tcMar>
+              <w:top w:w="0" w:type="dxa"/>
+              <w:left w:w="108" w:type="dxa"/>
+              <w:bottom w:w="0" w:type="dxa"/>
+              <w:right w:w="108" w:type="dxa"/>
+            </w:tcMar>
           </w:tcPr>
           <w:p>
+            <w:pPr>
+              <w:spacing w:after="200" w:line="276" w:lineRule="auto"/>
+            </w:pPr>
             <w:r>
-              <w:t>Apakah skema kontrol terasa wajar, mudah diingat, dan langsung merespons perintah tanpa jeda yang mengganggu?</w:t>
+              <w:rPr>
+                <w:rFonts w:cs="Cambria"/>
+              </w:rPr>
+              <w:t xml:space="preserve">Apakah skema kontrol terasa wajar, mudah diingat, dan langsung merespons perintah tanpa </w:t>
+            </w:r>
+            <w:r>
+              <w:rPr>
+                <w:rFonts w:cs="Cambria"/>
+              </w:rPr>
+              <w:lastRenderedPageBreak/>
+              <w:t>jeda yang mengganggu?</w:t>
             </w:r>
           </w:p>
         </w:tc>
         <w:tc>
           <w:tcPr>
             <w:tcW w:w="2880" w:type="dxa"/>
+            <w:tcBorders>
+              <w:top w:val="single" w:sz="4" w:space="0" w:color="auto"/>
+              <w:left w:val="single" w:sz="4" w:space="0" w:color="auto"/>
+              <w:bottom w:val="single" w:sz="4" w:space="0" w:color="auto"/>
+              <w:right w:val="single" w:sz="4" w:space="0" w:color="auto"/>
+            </w:tcBorders>
+            <w:tcMar>
+              <w:top w:w="0" w:type="dxa"/>
+              <w:left w:w="108" w:type="dxa"/>
+              <w:bottom w:w="0" w:type="dxa"/>
+              <w:right w:w="108" w:type="dxa"/>
+            </w:tcMar>
           </w:tcPr>
           <w:p>
+            <w:pPr>
+              <w:spacing w:after="200" w:line="276" w:lineRule="auto"/>
+            </w:pPr>
             <w:r>
+              <w:rPr>
+                <w:rFonts w:cs="Cambria"/>
+              </w:rPr>
+              <w:lastRenderedPageBreak/>
               <w:t>[  ]</w:t>
             </w:r>
           </w:p>
@@ -1188,9 +2622,27 @@
         <w:tc>
           <w:tcPr>
             <w:tcW w:w="2880" w:type="dxa"/>
+            <w:tcBorders>
+              <w:top w:val="single" w:sz="4" w:space="0" w:color="auto"/>
+              <w:left w:val="single" w:sz="4" w:space="0" w:color="auto"/>
+              <w:bottom w:val="single" w:sz="4" w:space="0" w:color="auto"/>
+              <w:right w:val="single" w:sz="4" w:space="0" w:color="auto"/>
+            </w:tcBorders>
+            <w:tcMar>
+              <w:top w:w="0" w:type="dxa"/>
+              <w:left w:w="108" w:type="dxa"/>
+              <w:bottom w:w="0" w:type="dxa"/>
+              <w:right w:w="108" w:type="dxa"/>
+            </w:tcMar>
           </w:tcPr>
           <w:p>
+            <w:pPr>
+              <w:spacing w:after="200" w:line="276" w:lineRule="auto"/>
+            </w:pPr>
             <w:r>
+              <w:rPr>
+                <w:rFonts w:cs="Cambria"/>
+              </w:rPr>
               <w:t>Pencegahan Frustrasi (Error Prevention)</w:t>
             </w:r>
           </w:p>
@@ -1198,9 +2650,27 @@
         <w:tc>
           <w:tcPr>
             <w:tcW w:w="2880" w:type="dxa"/>
+            <w:tcBorders>
+              <w:top w:val="single" w:sz="4" w:space="0" w:color="auto"/>
+              <w:left w:val="single" w:sz="4" w:space="0" w:color="auto"/>
+              <w:bottom w:val="single" w:sz="4" w:space="0" w:color="auto"/>
+              <w:right w:val="single" w:sz="4" w:space="0" w:color="auto"/>
+            </w:tcBorders>
+            <w:tcMar>
+              <w:top w:w="0" w:type="dxa"/>
+              <w:left w:w="108" w:type="dxa"/>
+              <w:bottom w:w="0" w:type="dxa"/>
+              <w:right w:w="108" w:type="dxa"/>
+            </w:tcMar>
           </w:tcPr>
           <w:p>
+            <w:pPr>
+              <w:spacing w:after="200" w:line="276" w:lineRule="auto"/>
+            </w:pPr>
             <w:r>
+              <w:rPr>
+                <w:rFonts w:cs="Cambria"/>
+              </w:rPr>
               <w:t>Apakah pemain memiliki cara untuk keluar, membatalkan aksi, pause, atau restart tanpa harus menutup paksa aplikasi?</w:t>
             </w:r>
           </w:p>
@@ -1208,9 +2678,27 @@
         <w:tc>
           <w:tcPr>
             <w:tcW w:w="2880" w:type="dxa"/>
+            <w:tcBorders>
+              <w:top w:val="single" w:sz="4" w:space="0" w:color="auto"/>
+              <w:left w:val="single" w:sz="4" w:space="0" w:color="auto"/>
+              <w:bottom w:val="single" w:sz="4" w:space="0" w:color="auto"/>
+              <w:right w:val="single" w:sz="4" w:space="0" w:color="auto"/>
+            </w:tcBorders>
+            <w:tcMar>
+              <w:top w:w="0" w:type="dxa"/>
+              <w:left w:w="108" w:type="dxa"/>
+              <w:bottom w:w="0" w:type="dxa"/>
+              <w:right w:w="108" w:type="dxa"/>
+            </w:tcMar>
           </w:tcPr>
           <w:p>
+            <w:pPr>
+              <w:spacing w:after="200" w:line="276" w:lineRule="auto"/>
+            </w:pPr>
             <w:r>
+              <w:rPr>
+                <w:rFonts w:cs="Cambria"/>
+              </w:rPr>
               <w:t>[  ]</w:t>
             </w:r>
           </w:p>
@@ -11133,7 +12621,7 @@
       </w:tcPr>
     </w:tblStylePr>
   </w:style>
-  <w:style w:type="table" w:styleId="ColorfulShading">
+  <w:style w:type="table" w:styleId="ColourfulShading">
     <w:name w:val="Colorful Shading"/>
     <w:basedOn w:val="TableNormal"/>
     <w:uiPriority w:val="71"/>
@@ -11248,7 +12736,7 @@
       </w:rPr>
     </w:tblStylePr>
   </w:style>
-  <w:style w:type="table" w:styleId="ColorfulShading-Accent1">
+  <w:style w:type="table" w:styleId="ColourfulShadingAccent1">
     <w:name w:val="Colorful Shading Accent 1"/>
     <w:basedOn w:val="TableNormal"/>
     <w:uiPriority w:val="71"/>
@@ -11363,7 +12851,7 @@
       </w:rPr>
     </w:tblStylePr>
   </w:style>
-  <w:style w:type="table" w:styleId="ColorfulShading-Accent2">
+  <w:style w:type="table" w:styleId="ColourfulShadingAccent2">
     <w:name w:val="Colorful Shading Accent 2"/>
     <w:basedOn w:val="TableNormal"/>
     <w:uiPriority w:val="71"/>
@@ -11478,7 +12966,7 @@
       </w:rPr>
     </w:tblStylePr>
   </w:style>
-  <w:style w:type="table" w:styleId="ColorfulShading-Accent3">
+  <w:style w:type="table" w:styleId="ColourfulShadingAccent3">
     <w:name w:val="Colorful Shading Accent 3"/>
     <w:basedOn w:val="TableNormal"/>
     <w:uiPriority w:val="71"/>
@@ -11583,7 +13071,7 @@
       </w:tcPr>
     </w:tblStylePr>
   </w:style>
-  <w:style w:type="table" w:styleId="ColorfulShading-Accent4">
+  <w:style w:type="table" w:styleId="ColourfulShadingAccent4">
     <w:name w:val="Colorful Shading Accent 4"/>
     <w:basedOn w:val="TableNormal"/>
     <w:uiPriority w:val="71"/>
@@ -11698,7 +13186,7 @@
       </w:rPr>
     </w:tblStylePr>
   </w:style>
-  <w:style w:type="table" w:styleId="ColorfulShading-Accent5">
+  <w:style w:type="table" w:styleId="ColourfulShadingAccent5">
     <w:name w:val="Colorful Shading Accent 5"/>
     <w:basedOn w:val="TableNormal"/>
     <w:uiPriority w:val="71"/>
@@ -11813,7 +13301,7 @@
       </w:rPr>
     </w:tblStylePr>
   </w:style>
-  <w:style w:type="table" w:styleId="ColorfulShading-Accent6">
+  <w:style w:type="table" w:styleId="ColourfulShadingAccent6">
     <w:name w:val="Colorful Shading Accent 6"/>
     <w:basedOn w:val="TableNormal"/>
     <w:uiPriority w:val="71"/>
@@ -11928,7 +13416,7 @@
       </w:rPr>
     </w:tblStylePr>
   </w:style>
-  <w:style w:type="table" w:styleId="ColorfulList">
+  <w:style w:type="table" w:styleId="ColourfulList">
     <w:name w:val="Colorful List"/>
     <w:basedOn w:val="TableNormal"/>
     <w:uiPriority w:val="72"/>
@@ -12007,7 +13495,7 @@
       </w:tcPr>
     </w:tblStylePr>
   </w:style>
-  <w:style w:type="table" w:styleId="ColorfulList-Accent1">
+  <w:style w:type="table" w:styleId="ColourfulListAccent1">
     <w:name w:val="Colorful List Accent 1"/>
     <w:basedOn w:val="TableNormal"/>
     <w:uiPriority w:val="72"/>
@@ -12086,7 +13574,7 @@
       </w:tcPr>
     </w:tblStylePr>
   </w:style>
-  <w:style w:type="table" w:styleId="ColorfulList-Accent2">
+  <w:style w:type="table" w:styleId="ColourfulListAccent2">
     <w:name w:val="Colorful List Accent 2"/>
     <w:basedOn w:val="TableNormal"/>
     <w:uiPriority w:val="72"/>
@@ -12165,7 +13653,7 @@
       </w:tcPr>
     </w:tblStylePr>
   </w:style>
-  <w:style w:type="table" w:styleId="ColorfulList-Accent3">
+  <w:style w:type="table" w:styleId="ColourfulListAccent3">
     <w:name w:val="Colorful List Accent 3"/>
     <w:basedOn w:val="TableNormal"/>
     <w:uiPriority w:val="72"/>
@@ -12244,7 +13732,7 @@
       </w:tcPr>
     </w:tblStylePr>
   </w:style>
-  <w:style w:type="table" w:styleId="ColorfulList-Accent4">
+  <w:style w:type="table" w:styleId="ColourfulListAccent4">
     <w:name w:val="Colorful List Accent 4"/>
     <w:basedOn w:val="TableNormal"/>
     <w:uiPriority w:val="72"/>
@@ -12323,7 +13811,7 @@
       </w:tcPr>
     </w:tblStylePr>
   </w:style>
-  <w:style w:type="table" w:styleId="ColorfulList-Accent5">
+  <w:style w:type="table" w:styleId="ColourfulListAccent5">
     <w:name w:val="Colorful List Accent 5"/>
     <w:basedOn w:val="TableNormal"/>
     <w:uiPriority w:val="72"/>
@@ -12402,7 +13890,7 @@
       </w:tcPr>
     </w:tblStylePr>
   </w:style>
-  <w:style w:type="table" w:styleId="ColorfulList-Accent6">
+  <w:style w:type="table" w:styleId="ColourfulListAccent6">
     <w:name w:val="Colorful List Accent 6"/>
     <w:basedOn w:val="TableNormal"/>
     <w:uiPriority w:val="72"/>
@@ -12481,7 +13969,7 @@
       </w:tcPr>
     </w:tblStylePr>
   </w:style>
-  <w:style w:type="table" w:styleId="ColorfulGrid">
+  <w:style w:type="table" w:styleId="ColourfulGrid">
     <w:name w:val="Colorful Grid"/>
     <w:basedOn w:val="TableNormal"/>
     <w:uiPriority w:val="73"/>
@@ -12554,7 +14042,7 @@
       </w:tcPr>
     </w:tblStylePr>
   </w:style>
-  <w:style w:type="table" w:styleId="ColorfulGrid-Accent1">
+  <w:style w:type="table" w:styleId="ColourfulGridAccent1">
     <w:name w:val="Colorful Grid Accent 1"/>
     <w:basedOn w:val="TableNormal"/>
     <w:uiPriority w:val="73"/>
@@ -12627,7 +14115,7 @@
       </w:tcPr>
     </w:tblStylePr>
   </w:style>
-  <w:style w:type="table" w:styleId="ColorfulGrid-Accent2">
+  <w:style w:type="table" w:styleId="ColourfulGridAccent2">
     <w:name w:val="Colorful Grid Accent 2"/>
     <w:basedOn w:val="TableNormal"/>
     <w:uiPriority w:val="73"/>
@@ -12700,7 +14188,7 @@
       </w:tcPr>
     </w:tblStylePr>
   </w:style>
-  <w:style w:type="table" w:styleId="ColorfulGrid-Accent3">
+  <w:style w:type="table" w:styleId="ColourfulGridAccent3">
     <w:name w:val="Colorful Grid Accent 3"/>
     <w:basedOn w:val="TableNormal"/>
     <w:uiPriority w:val="73"/>
@@ -12773,7 +14261,7 @@
       </w:tcPr>
     </w:tblStylePr>
   </w:style>
-  <w:style w:type="table" w:styleId="ColorfulGrid-Accent4">
+  <w:style w:type="table" w:styleId="ColourfulGridAccent4">
     <w:name w:val="Colorful Grid Accent 4"/>
     <w:basedOn w:val="TableNormal"/>
     <w:uiPriority w:val="73"/>
@@ -12846,7 +14334,7 @@
       </w:tcPr>
     </w:tblStylePr>
   </w:style>
-  <w:style w:type="table" w:styleId="ColorfulGrid-Accent5">
+  <w:style w:type="table" w:styleId="ColourfulGridAccent5">
     <w:name w:val="Colorful Grid Accent 5"/>
     <w:basedOn w:val="TableNormal"/>
     <w:uiPriority w:val="73"/>
@@ -12919,7 +14407,7 @@
       </w:tcPr>
     </w:tblStylePr>
   </w:style>
-  <w:style w:type="table" w:styleId="ColorfulGrid-Accent6">
+  <w:style w:type="table" w:styleId="ColourfulGridAccent6">
     <w:name w:val="Colorful Grid Accent 6"/>
     <w:basedOn w:val="TableNormal"/>
     <w:uiPriority w:val="73"/>

</xml_diff>